<commit_message>
commit final giao ly
</commit_message>
<xml_diff>
--- a/docs/Huong-dan-su-dung-Quan-tri-xu.docx
+++ b/docs/Huong-dan-su-dung-Quan-tri-xu.docx
@@ -90,7 +90,7 @@
           <w:sz w:val="22"/>
           <w:szCs w:val="22"/>
         </w:rPr>
-        <w:t xml:space="preserve">Cập nhật: 21/07/2026</w:t>
+        <w:t xml:space="preserve">Cập nhật: 27/07/2026</w:t>
       </w:r>
     </w:p>
     <w:p>
@@ -929,20 +929,52 @@
           <w:sz w:val="24"/>
           <w:szCs w:val="24"/>
         </w:rPr>
-        <w:t xml:space="preserve">Sửa thông tin học sinh toàn giáo xứ: GLV cập nhật hồ sơ học sinh toàn xứ (không gồm tạo/xóa học sinh hay liên kết giáo dân).</w:t>
-      </w:r>
-    </w:p>
-    <w:p>
-      <w:pPr>
-        <w:jc w:val="both"/>
-        <w:spacing w:after="120"/>
-      </w:pPr>
-      <w:r>
-        <w:rPr>
-          <w:sz w:val="24"/>
-          <w:szCs w:val="24"/>
-        </w:rPr>
-        <w:t xml:space="preserve">Chỉ Quản trị xứ (và Super admin) mới cấp được các quyền này. Bỏ chọn để thu hồi bất cứ lúc nào.</w:t>
+        <w:t xml:space="preserve">Sửa thông tin học sinh toàn giáo xứ: GLV cập nhật hồ sơ học sinh toàn xứ (không gồm tạo/xóa học sinh, thống kê hay import).</w:t>
+      </w:r>
+    </w:p>
+    <w:p>
+      <w:pPr>
+        <w:spacing w:after="60"/>
+        <w:numPr>
+          <w:ilvl w:val="0"/>
+          <w:numId w:val="4"/>
+        </w:numPr>
+      </w:pPr>
+      <w:r>
+        <w:rPr>
+          <w:sz w:val="24"/>
+          <w:szCs w:val="24"/>
+        </w:rPr>
+        <w:t xml:space="preserve">Điểm danh giáo lý viên: GLV điểm danh được các buổi GLV (đi dạy / đi lễ / họp).</w:t>
+      </w:r>
+    </w:p>
+    <w:p>
+      <w:pPr>
+        <w:spacing w:after="60"/>
+        <w:numPr>
+          <w:ilvl w:val="0"/>
+          <w:numId w:val="4"/>
+        </w:numPr>
+      </w:pPr>
+      <w:r>
+        <w:rPr>
+          <w:sz w:val="24"/>
+          <w:szCs w:val="24"/>
+        </w:rPr>
+        <w:t xml:space="preserve">Tạo phiên điểm danh: GLV tạo và khóa/mở phiên điểm danh học sinh và buổi điểm danh GLV (không xóa phiên).</w:t>
+      </w:r>
+    </w:p>
+    <w:p>
+      <w:pPr>
+        <w:jc w:val="both"/>
+        <w:spacing w:after="120"/>
+      </w:pPr>
+      <w:r>
+        <w:rPr>
+          <w:sz w:val="24"/>
+          <w:szCs w:val="24"/>
+        </w:rPr>
+        <w:t xml:space="preserve">Quản trị xứ và Quản trị giáo lý mới cấp được các quyền này. Bỏ chọn để thu hồi bất cứ lúc nào.</w:t>
       </w:r>
     </w:p>
     <w:p>
@@ -2273,7 +2305,7 @@
 <file path=word/numbering.xml><?xml version="1.0" encoding="utf-8"?>
 <w:numbering xmlns:ve="http://schemas.openxmlformats.org/markup-compatibility/2006" xmlns:o="urn:schemas-microsoft-com:office:office" xmlns:r="http://schemas.openxmlformats.org/officeDocument/2006/relationships" xmlns:m="http://schemas.openxmlformats.org/officeDocument/2006/math" xmlns:v="urn:schemas-microsoft-com:vml" xmlns:wp="http://schemas.openxmlformats.org/drawingml/2006/wordprocessingDrawing" xmlns:w10="urn:schemas-microsoft-com:office:word" xmlns:w="http://schemas.openxmlformats.org/wordprocessingml/2006/main" xmlns:wne="http://schemas.microsoft.com/office/word/2006/wordml">
   <w:abstractNum w:abstractNumId="4">
-    <w:nsid w:val="71B04830"/>
+    <w:nsid w:val="7894CFA1"/>
     <w:multiLevelType w:val="hybridMultilevel"/>
     <w:lvl w:ilvl="0">
       <w:start w:val="1"/>

</xml_diff>

<commit_message>
commit fix bug diem danh trong
</commit_message>
<xml_diff>
--- a/docs/Huong-dan-su-dung-Quan-tri-xu.docx
+++ b/docs/Huong-dan-su-dung-Quan-tri-xu.docx
@@ -90,7 +90,7 @@
           <w:sz w:val="22"/>
           <w:szCs w:val="22"/>
         </w:rPr>
-        <w:t xml:space="preserve">Cập nhật: 27/07/2026</w:t>
+        <w:t xml:space="preserve">Cập nhật: 30/07/2026</w:t>
       </w:r>
     </w:p>
     <w:p>
@@ -99,6 +99,10 @@
       </w:r>
     </w:p>
     <w:p>
+      <w:pPr/>
+      <w:br/>
+    </w:p>
+    <w:p>
       <w:pPr>
         <w:pStyle w:val="Heading1"/>
       </w:pPr>
@@ -220,6 +224,10 @@
       <w:r>
         <w:br w:type="page"/>
       </w:r>
+    </w:p>
+    <w:p>
+      <w:pPr/>
+      <w:br/>
     </w:p>
     <w:p>
       <w:pPr>
@@ -249,7 +257,7 @@
         <w:spacing w:after="60"/>
         <w:numPr>
           <w:ilvl w:val="0"/>
-          <w:numId w:val="4"/>
+          <w:numId w:val="5"/>
         </w:numPr>
       </w:pPr>
       <w:r>
@@ -265,7 +273,7 @@
         <w:spacing w:after="60"/>
         <w:numPr>
           <w:ilvl w:val="0"/>
-          <w:numId w:val="4"/>
+          <w:numId w:val="5"/>
         </w:numPr>
       </w:pPr>
       <w:r>
@@ -342,7 +350,7 @@
         <w:spacing w:after="60"/>
         <w:numPr>
           <w:ilvl w:val="0"/>
-          <w:numId w:val="4"/>
+          <w:numId w:val="5"/>
         </w:numPr>
       </w:pPr>
       <w:r>
@@ -358,7 +366,7 @@
         <w:spacing w:after="60"/>
         <w:numPr>
           <w:ilvl w:val="0"/>
-          <w:numId w:val="4"/>
+          <w:numId w:val="5"/>
         </w:numPr>
       </w:pPr>
       <w:r>
@@ -374,7 +382,7 @@
         <w:spacing w:after="60"/>
         <w:numPr>
           <w:ilvl w:val="0"/>
-          <w:numId w:val="4"/>
+          <w:numId w:val="5"/>
         </w:numPr>
       </w:pPr>
       <w:r>
@@ -413,7 +421,7 @@
         <w:spacing w:after="60"/>
         <w:numPr>
           <w:ilvl w:val="0"/>
-          <w:numId w:val="4"/>
+          <w:numId w:val="5"/>
         </w:numPr>
       </w:pPr>
       <w:r>
@@ -429,7 +437,7 @@
         <w:spacing w:after="60"/>
         <w:numPr>
           <w:ilvl w:val="0"/>
-          <w:numId w:val="4"/>
+          <w:numId w:val="5"/>
         </w:numPr>
       </w:pPr>
       <w:r>
@@ -519,7 +527,7 @@
         <w:spacing w:after="60"/>
         <w:numPr>
           <w:ilvl w:val="0"/>
-          <w:numId w:val="4"/>
+          <w:numId w:val="5"/>
         </w:numPr>
       </w:pPr>
       <w:r>
@@ -535,7 +543,7 @@
         <w:spacing w:after="60"/>
         <w:numPr>
           <w:ilvl w:val="0"/>
-          <w:numId w:val="4"/>
+          <w:numId w:val="5"/>
         </w:numPr>
       </w:pPr>
       <w:r>
@@ -633,7 +641,7 @@
         <w:spacing w:after="60"/>
         <w:numPr>
           <w:ilvl w:val="0"/>
-          <w:numId w:val="4"/>
+          <w:numId w:val="5"/>
         </w:numPr>
       </w:pPr>
       <w:r>
@@ -649,7 +657,7 @@
         <w:spacing w:after="60"/>
         <w:numPr>
           <w:ilvl w:val="0"/>
-          <w:numId w:val="4"/>
+          <w:numId w:val="5"/>
         </w:numPr>
       </w:pPr>
       <w:r>
@@ -665,7 +673,7 @@
         <w:spacing w:after="60"/>
         <w:numPr>
           <w:ilvl w:val="0"/>
-          <w:numId w:val="4"/>
+          <w:numId w:val="5"/>
         </w:numPr>
       </w:pPr>
       <w:r>
@@ -681,7 +689,7 @@
         <w:spacing w:after="60"/>
         <w:numPr>
           <w:ilvl w:val="0"/>
-          <w:numId w:val="4"/>
+          <w:numId w:val="5"/>
         </w:numPr>
       </w:pPr>
       <w:r>
@@ -735,7 +743,7 @@
         <w:spacing w:after="60"/>
         <w:numPr>
           <w:ilvl w:val="0"/>
-          <w:numId w:val="4"/>
+          <w:numId w:val="5"/>
         </w:numPr>
       </w:pPr>
       <w:r>
@@ -751,7 +759,7 @@
         <w:spacing w:after="60"/>
         <w:numPr>
           <w:ilvl w:val="0"/>
-          <w:numId w:val="4"/>
+          <w:numId w:val="5"/>
         </w:numPr>
       </w:pPr>
       <w:r>
@@ -767,7 +775,7 @@
         <w:spacing w:after="60"/>
         <w:numPr>
           <w:ilvl w:val="0"/>
-          <w:numId w:val="4"/>
+          <w:numId w:val="5"/>
         </w:numPr>
       </w:pPr>
       <w:r>
@@ -819,7 +827,7 @@
         <w:spacing w:after="60"/>
         <w:numPr>
           <w:ilvl w:val="0"/>
-          <w:numId w:val="4"/>
+          <w:numId w:val="5"/>
         </w:numPr>
       </w:pPr>
       <w:r>
@@ -835,7 +843,7 @@
         <w:spacing w:after="60"/>
         <w:numPr>
           <w:ilvl w:val="0"/>
-          <w:numId w:val="4"/>
+          <w:numId w:val="5"/>
         </w:numPr>
       </w:pPr>
       <w:r>
@@ -851,7 +859,7 @@
         <w:spacing w:after="60"/>
         <w:numPr>
           <w:ilvl w:val="0"/>
-          <w:numId w:val="4"/>
+          <w:numId w:val="5"/>
         </w:numPr>
       </w:pPr>
       <w:r>
@@ -905,23 +913,23 @@
         <w:spacing w:after="60"/>
         <w:numPr>
           <w:ilvl w:val="0"/>
-          <w:numId w:val="4"/>
-        </w:numPr>
-      </w:pPr>
-      <w:r>
-        <w:rPr>
-          <w:sz w:val="24"/>
-          <w:szCs w:val="24"/>
-        </w:rPr>
-        <w:t xml:space="preserve">Quản lý điểm toàn giáo xứ: GLV xem, nhập và sửa điểm mọi lớp trong xứ khi cửa sổ nhập điểm đang mở.</w:t>
-      </w:r>
-    </w:p>
-    <w:p>
-      <w:pPr>
-        <w:spacing w:after="60"/>
-        <w:numPr>
-          <w:ilvl w:val="0"/>
-          <w:numId w:val="4"/>
+          <w:numId w:val="5"/>
+        </w:numPr>
+      </w:pPr>
+      <w:r>
+        <w:rPr>
+          <w:sz w:val="24"/>
+          <w:szCs w:val="24"/>
+        </w:rPr>
+        <w:t xml:space="preserve">Quản lý điểm toàn giáo xứ: GLV xem, nhập và sửa điểm mọi lớp trong xứ. Hệ thống không còn cửa sổ bật/tắt nhập điểm theo giáo xứ.</w:t>
+      </w:r>
+    </w:p>
+    <w:p>
+      <w:pPr>
+        <w:spacing w:after="60"/>
+        <w:numPr>
+          <w:ilvl w:val="0"/>
+          <w:numId w:val="5"/>
         </w:numPr>
       </w:pPr>
       <w:r>
@@ -937,7 +945,7 @@
         <w:spacing w:after="60"/>
         <w:numPr>
           <w:ilvl w:val="0"/>
-          <w:numId w:val="4"/>
+          <w:numId w:val="5"/>
         </w:numPr>
       </w:pPr>
       <w:r>
@@ -953,7 +961,7 @@
         <w:spacing w:after="60"/>
         <w:numPr>
           <w:ilvl w:val="0"/>
-          <w:numId w:val="4"/>
+          <w:numId w:val="5"/>
         </w:numPr>
       </w:pPr>
       <w:r>
@@ -1033,7 +1041,7 @@
         <w:spacing w:after="60"/>
         <w:numPr>
           <w:ilvl w:val="0"/>
-          <w:numId w:val="4"/>
+          <w:numId w:val="5"/>
         </w:numPr>
       </w:pPr>
       <w:r>
@@ -1049,7 +1057,7 @@
         <w:spacing w:after="60"/>
         <w:numPr>
           <w:ilvl w:val="0"/>
-          <w:numId w:val="4"/>
+          <w:numId w:val="5"/>
         </w:numPr>
       </w:pPr>
       <w:r>
@@ -1065,7 +1073,7 @@
         <w:spacing w:after="60"/>
         <w:numPr>
           <w:ilvl w:val="0"/>
-          <w:numId w:val="4"/>
+          <w:numId w:val="5"/>
         </w:numPr>
       </w:pPr>
       <w:r>
@@ -1081,7 +1089,7 @@
         <w:spacing w:after="60"/>
         <w:numPr>
           <w:ilvl w:val="0"/>
-          <w:numId w:val="4"/>
+          <w:numId w:val="5"/>
         </w:numPr>
       </w:pPr>
       <w:r>
@@ -1125,15 +1133,15 @@
           <w:sz w:val="24"/>
           <w:szCs w:val="24"/>
         </w:rPr>
-        <w:t xml:space="preserve">Vào Giáo lý → Điểm danh / Phiên điểm danh.</w:t>
-      </w:r>
-    </w:p>
-    <w:p>
-      <w:pPr>
-        <w:spacing w:after="60"/>
-        <w:numPr>
-          <w:ilvl w:val="0"/>
-          <w:numId w:val="4"/>
+        <w:t xml:space="preserve">Vào Giáo lý → Điểm danh / Phiên điểm danh. Xem chương 10 để hiểu rõ giờ chốt, khóa/hủy buổi, KP suy luận, Excel và điểm chuyên cần.</w:t>
+      </w:r>
+    </w:p>
+    <w:p>
+      <w:pPr>
+        <w:spacing w:after="60"/>
+        <w:numPr>
+          <w:ilvl w:val="0"/>
+          <w:numId w:val="5"/>
         </w:numPr>
       </w:pPr>
       <w:r>
@@ -1149,7 +1157,7 @@
         <w:spacing w:after="60"/>
         <w:numPr>
           <w:ilvl w:val="0"/>
-          <w:numId w:val="4"/>
+          <w:numId w:val="5"/>
         </w:numPr>
       </w:pPr>
       <w:r>
@@ -1165,7 +1173,7 @@
         <w:spacing w:after="60"/>
         <w:numPr>
           <w:ilvl w:val="0"/>
-          <w:numId w:val="4"/>
+          <w:numId w:val="5"/>
         </w:numPr>
       </w:pPr>
       <w:r>
@@ -1181,7 +1189,7 @@
         <w:spacing w:after="60"/>
         <w:numPr>
           <w:ilvl w:val="0"/>
-          <w:numId w:val="4"/>
+          <w:numId w:val="5"/>
         </w:numPr>
       </w:pPr>
       <w:r>
@@ -1212,15 +1220,15 @@
           <w:sz w:val="24"/>
           <w:szCs w:val="24"/>
         </w:rPr>
-        <w:t xml:space="preserve">Vào Giáo lý → Kết quả học tập.</w:t>
-      </w:r>
-    </w:p>
-    <w:p>
-      <w:pPr>
-        <w:spacing w:after="60"/>
-        <w:numPr>
-          <w:ilvl w:val="0"/>
-          <w:numId w:val="4"/>
+        <w:t xml:space="preserve">Vào Giáo lý → Kết quả học tập. Xem chương 11 để cấu hình loại điểm, tỉ lệ học kỳ, chuyên cần, xếp loại và xuất Excel.</w:t>
+      </w:r>
+    </w:p>
+    <w:p>
+      <w:pPr>
+        <w:spacing w:after="60"/>
+        <w:numPr>
+          <w:ilvl w:val="0"/>
+          <w:numId w:val="5"/>
         </w:numPr>
       </w:pPr>
       <w:r>
@@ -1236,7 +1244,7 @@
         <w:spacing w:after="60"/>
         <w:numPr>
           <w:ilvl w:val="0"/>
-          <w:numId w:val="4"/>
+          <w:numId w:val="5"/>
         </w:numPr>
       </w:pPr>
       <w:r>
@@ -1344,7 +1352,7 @@
         <w:spacing w:after="60"/>
         <w:numPr>
           <w:ilvl w:val="0"/>
-          <w:numId w:val="4"/>
+          <w:numId w:val="5"/>
         </w:numPr>
       </w:pPr>
       <w:r>
@@ -1360,7 +1368,7 @@
         <w:spacing w:after="60"/>
         <w:numPr>
           <w:ilvl w:val="0"/>
-          <w:numId w:val="4"/>
+          <w:numId w:val="5"/>
         </w:numPr>
       </w:pPr>
       <w:r>
@@ -1376,7 +1384,7 @@
         <w:spacing w:after="60"/>
         <w:numPr>
           <w:ilvl w:val="0"/>
-          <w:numId w:val="4"/>
+          <w:numId w:val="5"/>
         </w:numPr>
       </w:pPr>
       <w:r>
@@ -1438,7 +1446,7 @@
         <w:spacing w:after="60"/>
         <w:numPr>
           <w:ilvl w:val="0"/>
-          <w:numId w:val="4"/>
+          <w:numId w:val="5"/>
         </w:numPr>
       </w:pPr>
       <w:r>
@@ -1454,7 +1462,7 @@
         <w:spacing w:after="60"/>
         <w:numPr>
           <w:ilvl w:val="0"/>
-          <w:numId w:val="4"/>
+          <w:numId w:val="5"/>
         </w:numPr>
       </w:pPr>
       <w:r>
@@ -1493,7 +1501,7 @@
         <w:spacing w:after="60"/>
         <w:numPr>
           <w:ilvl w:val="0"/>
-          <w:numId w:val="4"/>
+          <w:numId w:val="5"/>
         </w:numPr>
       </w:pPr>
       <w:r>
@@ -1509,7 +1517,7 @@
         <w:spacing w:after="60"/>
         <w:numPr>
           <w:ilvl w:val="0"/>
-          <w:numId w:val="4"/>
+          <w:numId w:val="5"/>
         </w:numPr>
       </w:pPr>
       <w:r>
@@ -1571,7 +1579,7 @@
         <w:spacing w:after="60"/>
         <w:numPr>
           <w:ilvl w:val="0"/>
-          <w:numId w:val="4"/>
+          <w:numId w:val="5"/>
         </w:numPr>
       </w:pPr>
       <w:r>
@@ -1587,7 +1595,7 @@
         <w:spacing w:after="60"/>
         <w:numPr>
           <w:ilvl w:val="0"/>
-          <w:numId w:val="4"/>
+          <w:numId w:val="5"/>
         </w:numPr>
       </w:pPr>
       <w:r>
@@ -1603,7 +1611,7 @@
         <w:spacing w:after="60"/>
         <w:numPr>
           <w:ilvl w:val="0"/>
-          <w:numId w:val="4"/>
+          <w:numId w:val="5"/>
         </w:numPr>
       </w:pPr>
       <w:r>
@@ -1690,7 +1698,7 @@
         <w:spacing w:after="60"/>
         <w:numPr>
           <w:ilvl w:val="0"/>
-          <w:numId w:val="4"/>
+          <w:numId w:val="5"/>
         </w:numPr>
       </w:pPr>
       <w:r>
@@ -1706,7 +1714,7 @@
         <w:spacing w:after="60"/>
         <w:numPr>
           <w:ilvl w:val="0"/>
-          <w:numId w:val="4"/>
+          <w:numId w:val="5"/>
         </w:numPr>
       </w:pPr>
       <w:r>
@@ -1722,7 +1730,7 @@
         <w:spacing w:after="60"/>
         <w:numPr>
           <w:ilvl w:val="0"/>
-          <w:numId w:val="4"/>
+          <w:numId w:val="5"/>
         </w:numPr>
       </w:pPr>
       <w:r>
@@ -1781,7 +1789,7 @@
         <w:spacing w:after="60"/>
         <w:numPr>
           <w:ilvl w:val="0"/>
-          <w:numId w:val="4"/>
+          <w:numId w:val="5"/>
         </w:numPr>
       </w:pPr>
       <w:r>
@@ -1797,7 +1805,7 @@
         <w:spacing w:after="60"/>
         <w:numPr>
           <w:ilvl w:val="0"/>
-          <w:numId w:val="4"/>
+          <w:numId w:val="5"/>
         </w:numPr>
       </w:pPr>
       <w:r>
@@ -1813,7 +1821,7 @@
         <w:spacing w:after="60"/>
         <w:numPr>
           <w:ilvl w:val="0"/>
-          <w:numId w:val="4"/>
+          <w:numId w:val="5"/>
         </w:numPr>
       </w:pPr>
       <w:r>
@@ -1829,7 +1837,7 @@
         <w:spacing w:after="60"/>
         <w:numPr>
           <w:ilvl w:val="0"/>
-          <w:numId w:val="4"/>
+          <w:numId w:val="5"/>
         </w:numPr>
       </w:pPr>
       <w:r>
@@ -1845,7 +1853,7 @@
         <w:spacing w:after="60"/>
         <w:numPr>
           <w:ilvl w:val="0"/>
-          <w:numId w:val="4"/>
+          <w:numId w:val="5"/>
         </w:numPr>
       </w:pPr>
       <w:r>
@@ -1861,7 +1869,7 @@
         <w:spacing w:after="60"/>
         <w:numPr>
           <w:ilvl w:val="0"/>
-          <w:numId w:val="4"/>
+          <w:numId w:val="5"/>
         </w:numPr>
       </w:pPr>
       <w:r>
@@ -1877,7 +1885,7 @@
         <w:spacing w:after="60"/>
         <w:numPr>
           <w:ilvl w:val="0"/>
-          <w:numId w:val="4"/>
+          <w:numId w:val="5"/>
         </w:numPr>
       </w:pPr>
       <w:r>
@@ -1893,7 +1901,7 @@
         <w:spacing w:after="60"/>
         <w:numPr>
           <w:ilvl w:val="0"/>
-          <w:numId w:val="4"/>
+          <w:numId w:val="5"/>
         </w:numPr>
       </w:pPr>
       <w:r>
@@ -1919,7 +1927,7 @@
         <w:spacing w:after="60"/>
         <w:numPr>
           <w:ilvl w:val="0"/>
-          <w:numId w:val="4"/>
+          <w:numId w:val="5"/>
         </w:numPr>
       </w:pPr>
       <w:r>
@@ -1935,7 +1943,7 @@
         <w:spacing w:after="60"/>
         <w:numPr>
           <w:ilvl w:val="0"/>
-          <w:numId w:val="4"/>
+          <w:numId w:val="5"/>
         </w:numPr>
       </w:pPr>
       <w:r>
@@ -1951,7 +1959,7 @@
         <w:spacing w:after="60"/>
         <w:numPr>
           <w:ilvl w:val="0"/>
-          <w:numId w:val="4"/>
+          <w:numId w:val="5"/>
         </w:numPr>
       </w:pPr>
       <w:r>
@@ -1967,7 +1975,7 @@
         <w:spacing w:after="60"/>
         <w:numPr>
           <w:ilvl w:val="0"/>
-          <w:numId w:val="4"/>
+          <w:numId w:val="5"/>
         </w:numPr>
       </w:pPr>
       <w:r>
@@ -1983,7 +1991,7 @@
         <w:spacing w:after="60"/>
         <w:numPr>
           <w:ilvl w:val="0"/>
-          <w:numId w:val="4"/>
+          <w:numId w:val="5"/>
         </w:numPr>
       </w:pPr>
       <w:r>
@@ -2070,7 +2078,7 @@
           <w:sz w:val="24"/>
           <w:szCs w:val="24"/>
         </w:rPr>
-        <w:t xml:space="preserve">Kiểm tra năm học đang kích hoạt, lớp thuộc năm đó, và học sinh đã được xếp vào lớp.</w:t>
+        <w:t xml:space="preserve">Kiểm tra năm học đang kích hoạt, lớp thuộc năm đó, học sinh đã được xếp vào lớp và bộ lọc đang chọn đúng học kỳ / loại buổi. Với chuyên cần, kiểm tra thêm buổi đã hủy, buổi chưa ai điểm danh và giờ chốt.</w:t>
       </w:r>
     </w:p>
     <w:p>
@@ -2160,7 +2168,7 @@
         <w:spacing w:after="60"/>
         <w:numPr>
           <w:ilvl w:val="0"/>
-          <w:numId w:val="4"/>
+          <w:numId w:val="5"/>
         </w:numPr>
       </w:pPr>
       <w:r>
@@ -2176,7 +2184,7 @@
         <w:spacing w:after="60"/>
         <w:numPr>
           <w:ilvl w:val="0"/>
-          <w:numId w:val="4"/>
+          <w:numId w:val="5"/>
         </w:numPr>
       </w:pPr>
       <w:r>
@@ -2192,7 +2200,7 @@
         <w:spacing w:after="60"/>
         <w:numPr>
           <w:ilvl w:val="0"/>
-          <w:numId w:val="4"/>
+          <w:numId w:val="5"/>
         </w:numPr>
       </w:pPr>
       <w:r>
@@ -2220,10 +2228,2582 @@
         <w:t xml:space="preserve">— Hết tài liệu hướng dẫn dành cho Quản trị xứ —</w:t>
       </w:r>
     </w:p>
+    <w:p>
+      <w:pPr>
+        <w:sectPr>
+          <w:footerReference w:type="default" r:id="rId7"/>
+          <w:pgSz w:orient="portrait" w:w="11905.511811023622" w:h="16837.79527559055"/>
+          <w:pgMar w:top="1134" w:right="1134" w:bottom="1134" w:left="1418" w:header="720" w:footer="720" w:gutter="0"/>
+          <w:cols w:num="1" w:space="720"/>
+        </w:sectPr>
+      </w:pPr>
+    </w:p>
+    <w:p>
+      <w:r>
+        <w:br w:type="page"/>
+      </w:r>
+    </w:p>
+    <w:p>
+      <w:pPr>
+        <w:jc w:val="center"/>
+        <w:spacing w:after="80"/>
+      </w:pPr>
+      <w:r>
+        <w:rPr>
+          <w:rFonts w:ascii="Arial" w:hAnsi="Arial" w:eastAsia="Arial" w:cs="Arial"/>
+          <w:color w:val="1D4ED8"/>
+          <w:sz w:val="36"/>
+          <w:szCs w:val="36"/>
+          <w:b w:val="1"/>
+          <w:bCs w:val="1"/>
+        </w:rPr>
+        <w:t xml:space="preserve">PHỤ LỤC NGHIỆP VỤ GIÁO LÝ</w:t>
+      </w:r>
+    </w:p>
+    <w:p>
+      <w:pPr>
+        <w:jc w:val="center"/>
+        <w:spacing w:after="300"/>
+      </w:pPr>
+      <w:r>
+        <w:rPr>
+          <w:rFonts w:ascii="Arial" w:hAnsi="Arial" w:eastAsia="Arial" w:cs="Arial"/>
+          <w:color w:val="64748B"/>
+          <w:sz w:val="20"/>
+          <w:szCs w:val="20"/>
+          <w:i w:val="1"/>
+          <w:iCs w:val="1"/>
+        </w:rPr>
+        <w:t xml:space="preserve">Cập nhật cơ chế điểm danh và điểm học tập · 30/07/2026</w:t>
+      </w:r>
+    </w:p>
+    <w:tbl>
+      <w:tblGrid>
+        <w:gridCol/>
+      </w:tblGrid>
+      <w:tblPr>
+        <w:tblW w:w="5000" w:type="pct"/>
+        <w:tblLayout w:type="autofit"/>
+        <w:tblCellMar>
+          <w:top w:w="100" w:type="dxa"/>
+          <w:left w:w="100" w:type="dxa"/>
+          <w:right w:w="100" w:type="dxa"/>
+          <w:bottom w:w="100" w:type="dxa"/>
+        </w:tblCellMar>
+        <w:tblBorders>
+          <w:top w:val="single" w:sz="6" w:color="F59E0B"/>
+          <w:left w:val="single" w:sz="6" w:color="F59E0B"/>
+          <w:right w:val="single" w:sz="6" w:color="F59E0B"/>
+          <w:bottom w:val="single" w:sz="6" w:color="F59E0B"/>
+          <w:insideH w:val="single" w:sz="6" w:color="F59E0B"/>
+          <w:insideV w:val="single" w:sz="6" w:color="F59E0B"/>
+        </w:tblBorders>
+      </w:tblPr>
+      <w:tr>
+        <w:trPr/>
+        <w:tc>
+          <w:tcPr>
+            <w:shd w:val="clear" w:fill="FFF7ED"/>
+            <w:noWrap/>
+          </w:tcPr>
+          <w:p>
+            <w:pPr>
+              <w:spacing w:after="0" w:line="264" w:lineRule="auto"/>
+            </w:pPr>
+            <w:r>
+              <w:rPr>
+                <w:rFonts w:ascii="Arial" w:hAnsi="Arial" w:eastAsia="Arial" w:cs="Arial"/>
+                <w:color w:val="9A3412"/>
+                <w:sz w:val="20"/>
+                <w:szCs w:val="20"/>
+                <w:b w:val="1"/>
+                <w:bCs w:val="1"/>
+              </w:rPr>
+              <w:t xml:space="preserve">Nguồn hướng dẫn trong hệ thống: </w:t>
+            </w:r>
+            <w:r>
+              <w:rPr>
+                <w:rFonts w:ascii="Arial" w:hAnsi="Arial" w:eastAsia="Arial" w:cs="Arial"/>
+                <w:color w:val="7C2D12"/>
+                <w:sz w:val="20"/>
+                <w:szCs w:val="20"/>
+              </w:rPr>
+              <w:t xml:space="preserve">Trong ứng dụng, mở Trợ giúp → Hướng dẫn điểm danh hoặc Hướng dẫn nhập điểm để xem bản cập nhật trực tuyến.</w:t>
+            </w:r>
+          </w:p>
+        </w:tc>
+      </w:tr>
+    </w:tbl>
+    <w:p/>
+    <w:p>
+      <w:pPr>
+        <w:pStyle w:val="Heading1"/>
+      </w:pPr>
+      <w:bookmarkStart w:id="39" w:name="_Toc39"/>
+      <w:r>
+        <w:t>10. Hướng dẫn chi tiết điểm danh</w:t>
+      </w:r>
+      <w:bookmarkEnd w:id="39"/>
+    </w:p>
+    <w:p>
+      <w:pPr>
+        <w:pStyle w:val="Heading2"/>
+      </w:pPr>
+      <w:bookmarkStart w:id="40" w:name="_Toc40"/>
+      <w:r>
+        <w:t>10.1. Hai màn hình và quy trình chuẩn</w:t>
+      </w:r>
+      <w:bookmarkEnd w:id="40"/>
+    </w:p>
+    <w:p>
+      <w:pPr>
+        <w:spacing w:after="120" w:line="276" w:lineRule="auto"/>
+      </w:pPr>
+      <w:r>
+        <w:rPr>
+          <w:rFonts w:ascii="Arial" w:hAnsi="Arial" w:eastAsia="Arial" w:cs="Arial"/>
+          <w:sz w:val="21"/>
+          <w:szCs w:val="21"/>
+        </w:rPr>
+        <w:t xml:space="preserve">Phiên điểm danh dùng để tạo, khóa, mở lại hoặc hủy các buổi. Trang Điểm danh dùng để đánh dấu từng học sinh theo các buổi đã tạo.</w:t>
+      </w:r>
+    </w:p>
+    <w:p>
+      <w:pPr>
+        <w:spacing w:after="60" w:line="264" w:lineRule="auto"/>
+        <w:numPr>
+          <w:ilvl w:val="0"/>
+          <w:numId w:val="7"/>
+        </w:numPr>
+      </w:pPr>
+      <w:r>
+        <w:rPr>
+          <w:rFonts w:ascii="Arial" w:hAnsi="Arial" w:eastAsia="Arial" w:cs="Arial"/>
+          <w:sz w:val="21"/>
+          <w:szCs w:val="21"/>
+        </w:rPr>
+        <w:t xml:space="preserve">Chuẩn bị năm học, lớp và ghi danh học sinh vào lớp.</w:t>
+      </w:r>
+    </w:p>
+    <w:p>
+      <w:pPr>
+        <w:spacing w:after="60" w:line="264" w:lineRule="auto"/>
+        <w:numPr>
+          <w:ilvl w:val="0"/>
+          <w:numId w:val="7"/>
+        </w:numPr>
+      </w:pPr>
+      <w:r>
+        <w:rPr>
+          <w:rFonts w:ascii="Arial" w:hAnsi="Arial" w:eastAsia="Arial" w:cs="Arial"/>
+          <w:sz w:val="21"/>
+          <w:szCs w:val="21"/>
+        </w:rPr>
+        <w:t xml:space="preserve">Vào Phiên điểm danh, chọn năm học → khối → lớp, rồi tạo buổi Đi học hoặc Đi lễ.</w:t>
+      </w:r>
+    </w:p>
+    <w:p>
+      <w:pPr>
+        <w:spacing w:after="60" w:line="264" w:lineRule="auto"/>
+        <w:numPr>
+          <w:ilvl w:val="0"/>
+          <w:numId w:val="7"/>
+        </w:numPr>
+      </w:pPr>
+      <w:r>
+        <w:rPr>
+          <w:rFonts w:ascii="Arial" w:hAnsi="Arial" w:eastAsia="Arial" w:cs="Arial"/>
+          <w:sz w:val="21"/>
+          <w:szCs w:val="21"/>
+        </w:rPr>
+        <w:t xml:space="preserve">Vào Điểm danh, chọn đúng lớp, học kỳ và loại buổi.</w:t>
+      </w:r>
+    </w:p>
+    <w:p>
+      <w:pPr>
+        <w:spacing w:after="60" w:line="264" w:lineRule="auto"/>
+        <w:numPr>
+          <w:ilvl w:val="0"/>
+          <w:numId w:val="7"/>
+        </w:numPr>
+      </w:pPr>
+      <w:r>
+        <w:rPr>
+          <w:rFonts w:ascii="Arial" w:hAnsi="Arial" w:eastAsia="Arial" w:cs="Arial"/>
+          <w:sz w:val="21"/>
+          <w:szCs w:val="21"/>
+        </w:rPr>
+        <w:t xml:space="preserve">Đánh dấu từng em hoặc dùng “✓ Tất cả”, sau đó bấm Lưu.</w:t>
+      </w:r>
+    </w:p>
+    <w:p>
+      <w:pPr>
+        <w:spacing w:after="60" w:line="264" w:lineRule="auto"/>
+        <w:numPr>
+          <w:ilvl w:val="0"/>
+          <w:numId w:val="7"/>
+        </w:numPr>
+      </w:pPr>
+      <w:r>
+        <w:rPr>
+          <w:rFonts w:ascii="Arial" w:hAnsi="Arial" w:eastAsia="Arial" w:cs="Arial"/>
+          <w:sz w:val="21"/>
+          <w:szCs w:val="21"/>
+        </w:rPr>
+        <w:t xml:space="preserve">Khóa buổi khi đã hoàn tất nếu muốn kết luận số liệu trước giờ chốt; hủy buổi nếu lớp nghỉ.</w:t>
+      </w:r>
+    </w:p>
+    <w:p>
+      <w:pPr>
+        <w:pStyle w:val="Heading2"/>
+      </w:pPr>
+      <w:bookmarkStart w:id="41" w:name="_Toc41"/>
+      <w:r>
+        <w:t>10.2. Trạng thái buổi và trạng thái học sinh</w:t>
+      </w:r>
+      <w:bookmarkEnd w:id="41"/>
+    </w:p>
+    <w:tbl>
+      <w:tblGrid>
+        <w:gridCol w:w="1700" w:type="dxa"/>
+        <w:gridCol w:w="3300" w:type="dxa"/>
+        <w:gridCol w:w="3900" w:type="dxa"/>
+      </w:tblGrid>
+      <w:tblPr>
+        <w:tblW w:w="5000" w:type="pct"/>
+        <w:tblLayout w:type="autofit"/>
+        <w:tblCellMar>
+          <w:top w:w="80" w:type="dxa"/>
+          <w:left w:w="80" w:type="dxa"/>
+          <w:right w:w="80" w:type="dxa"/>
+          <w:bottom w:w="80" w:type="dxa"/>
+        </w:tblCellMar>
+        <w:tblBorders>
+          <w:top w:val="single" w:sz="4" w:color="CBD5E1"/>
+          <w:left w:val="single" w:sz="4" w:color="CBD5E1"/>
+          <w:right w:val="single" w:sz="4" w:color="CBD5E1"/>
+          <w:bottom w:val="single" w:sz="4" w:color="CBD5E1"/>
+          <w:insideH w:val="single" w:sz="4" w:color="CBD5E1"/>
+          <w:insideV w:val="single" w:sz="4" w:color="CBD5E1"/>
+        </w:tblBorders>
+      </w:tblPr>
+      <w:tr>
+        <w:trPr/>
+        <w:tc>
+          <w:tcPr>
+            <w:tcW w:w="1700" w:type="dxa"/>
+            <w:shd w:val="clear" w:fill="E2E8F0"/>
+            <w:noWrap/>
+          </w:tcPr>
+          <w:p>
+            <w:pPr/>
+            <w:r>
+              <w:rPr>
+                <w:rFonts w:ascii="Arial" w:hAnsi="Arial" w:eastAsia="Arial" w:cs="Arial"/>
+                <w:color w:val="334155"/>
+                <w:sz w:val="19"/>
+                <w:szCs w:val="19"/>
+                <w:b w:val="1"/>
+                <w:bCs w:val="1"/>
+              </w:rPr>
+              <w:t xml:space="preserve">Trạng thái</w:t>
+            </w:r>
+          </w:p>
+        </w:tc>
+        <w:tc>
+          <w:tcPr>
+            <w:tcW w:w="3300" w:type="dxa"/>
+            <w:shd w:val="clear" w:fill="E2E8F0"/>
+            <w:noWrap/>
+          </w:tcPr>
+          <w:p>
+            <w:pPr/>
+            <w:r>
+              <w:rPr>
+                <w:rFonts w:ascii="Arial" w:hAnsi="Arial" w:eastAsia="Arial" w:cs="Arial"/>
+                <w:color w:val="334155"/>
+                <w:sz w:val="19"/>
+                <w:szCs w:val="19"/>
+                <w:b w:val="1"/>
+                <w:bCs w:val="1"/>
+              </w:rPr>
+              <w:t xml:space="preserve">Ý nghĩa</w:t>
+            </w:r>
+          </w:p>
+        </w:tc>
+        <w:tc>
+          <w:tcPr>
+            <w:tcW w:w="3900" w:type="dxa"/>
+            <w:shd w:val="clear" w:fill="E2E8F0"/>
+            <w:noWrap/>
+          </w:tcPr>
+          <w:p>
+            <w:pPr/>
+            <w:r>
+              <w:rPr>
+                <w:rFonts w:ascii="Arial" w:hAnsi="Arial" w:eastAsia="Arial" w:cs="Arial"/>
+                <w:color w:val="334155"/>
+                <w:sz w:val="19"/>
+                <w:szCs w:val="19"/>
+                <w:b w:val="1"/>
+                <w:bCs w:val="1"/>
+              </w:rPr>
+              <w:t xml:space="preserve">Ảnh hưởng</w:t>
+            </w:r>
+          </w:p>
+        </w:tc>
+      </w:tr>
+      <w:tr>
+        <w:trPr/>
+        <w:tc>
+          <w:tcPr>
+            <w:tcW w:w="1700" w:type="dxa"/>
+            <w:noWrap/>
+          </w:tcPr>
+          <w:p>
+            <w:pPr/>
+            <w:r>
+              <w:rPr>
+                <w:rFonts w:ascii="Arial" w:hAnsi="Arial" w:eastAsia="Arial" w:cs="Arial"/>
+                <w:color w:val="334155"/>
+                <w:sz w:val="19"/>
+                <w:szCs w:val="19"/>
+              </w:rPr>
+              <w:t xml:space="preserve">Buổi đang mở</w:t>
+            </w:r>
+          </w:p>
+        </w:tc>
+        <w:tc>
+          <w:tcPr>
+            <w:tcW w:w="3300" w:type="dxa"/>
+            <w:noWrap/>
+          </w:tcPr>
+          <w:p>
+            <w:pPr/>
+            <w:r>
+              <w:rPr>
+                <w:rFonts w:ascii="Arial" w:hAnsi="Arial" w:eastAsia="Arial" w:cs="Arial"/>
+                <w:color w:val="334155"/>
+                <w:sz w:val="19"/>
+                <w:szCs w:val="19"/>
+              </w:rPr>
+              <w:t xml:space="preserve">Được điểm danh, quét QR và sửa.</w:t>
+            </w:r>
+          </w:p>
+        </w:tc>
+        <w:tc>
+          <w:tcPr>
+            <w:tcW w:w="3900" w:type="dxa"/>
+            <w:noWrap/>
+          </w:tcPr>
+          <w:p>
+            <w:pPr/>
+            <w:r>
+              <w:rPr>
+                <w:rFonts w:ascii="Arial" w:hAnsi="Arial" w:eastAsia="Arial" w:cs="Arial"/>
+                <w:color w:val="334155"/>
+                <w:sz w:val="19"/>
+                <w:szCs w:val="19"/>
+              </w:rPr>
+              <w:t xml:space="preserve">Tự kết luận theo giờ chốt nếu buổi đã có dữ liệu.</w:t>
+            </w:r>
+          </w:p>
+        </w:tc>
+      </w:tr>
+      <w:tr>
+        <w:trPr/>
+        <w:tc>
+          <w:tcPr>
+            <w:tcW w:w="1700" w:type="dxa"/>
+            <w:noWrap/>
+          </w:tcPr>
+          <w:p>
+            <w:pPr/>
+            <w:r>
+              <w:rPr>
+                <w:rFonts w:ascii="Arial" w:hAnsi="Arial" w:eastAsia="Arial" w:cs="Arial"/>
+                <w:color w:val="334155"/>
+                <w:sz w:val="19"/>
+                <w:szCs w:val="19"/>
+              </w:rPr>
+              <w:t xml:space="preserve">Buổi đã khóa</w:t>
+            </w:r>
+          </w:p>
+        </w:tc>
+        <w:tc>
+          <w:tcPr>
+            <w:tcW w:w="3300" w:type="dxa"/>
+            <w:noWrap/>
+          </w:tcPr>
+          <w:p>
+            <w:pPr/>
+            <w:r>
+              <w:rPr>
+                <w:rFonts w:ascii="Arial" w:hAnsi="Arial" w:eastAsia="Arial" w:cs="Arial"/>
+                <w:color w:val="334155"/>
+                <w:sz w:val="19"/>
+                <w:szCs w:val="19"/>
+              </w:rPr>
+              <w:t xml:space="preserve">Không sửa/quét thêm; có thể Mở lại.</w:t>
+            </w:r>
+          </w:p>
+        </w:tc>
+        <w:tc>
+          <w:tcPr>
+            <w:tcW w:w="3900" w:type="dxa"/>
+            <w:noWrap/>
+          </w:tcPr>
+          <w:p>
+            <w:pPr/>
+            <w:r>
+              <w:rPr>
+                <w:rFonts w:ascii="Arial" w:hAnsi="Arial" w:eastAsia="Arial" w:cs="Arial"/>
+                <w:color w:val="334155"/>
+                <w:sz w:val="19"/>
+                <w:szCs w:val="19"/>
+              </w:rPr>
+              <w:t xml:space="preserve">Ô còn thiếu được suy luận KP nếu buổi đã có ít nhất một em được điểm.</w:t>
+            </w:r>
+          </w:p>
+        </w:tc>
+      </w:tr>
+      <w:tr>
+        <w:trPr/>
+        <w:tc>
+          <w:tcPr>
+            <w:tcW w:w="1700" w:type="dxa"/>
+            <w:noWrap/>
+          </w:tcPr>
+          <w:p>
+            <w:pPr/>
+            <w:r>
+              <w:rPr>
+                <w:rFonts w:ascii="Arial" w:hAnsi="Arial" w:eastAsia="Arial" w:cs="Arial"/>
+                <w:color w:val="334155"/>
+                <w:sz w:val="19"/>
+                <w:szCs w:val="19"/>
+              </w:rPr>
+              <w:t xml:space="preserve">Buổi đã hủy</w:t>
+            </w:r>
+          </w:p>
+        </w:tc>
+        <w:tc>
+          <w:tcPr>
+            <w:tcW w:w="3300" w:type="dxa"/>
+            <w:noWrap/>
+          </w:tcPr>
+          <w:p>
+            <w:pPr/>
+            <w:r>
+              <w:rPr>
+                <w:rFonts w:ascii="Arial" w:hAnsi="Arial" w:eastAsia="Arial" w:cs="Arial"/>
+                <w:color w:val="334155"/>
+                <w:sz w:val="19"/>
+                <w:szCs w:val="19"/>
+              </w:rPr>
+              <w:t xml:space="preserve">Lớp nghỉ / buổi không diễn ra.</w:t>
+            </w:r>
+          </w:p>
+        </w:tc>
+        <w:tc>
+          <w:tcPr>
+            <w:tcW w:w="3900" w:type="dxa"/>
+            <w:noWrap/>
+          </w:tcPr>
+          <w:p>
+            <w:pPr/>
+            <w:r>
+              <w:rPr>
+                <w:rFonts w:ascii="Arial" w:hAnsi="Arial" w:eastAsia="Arial" w:cs="Arial"/>
+                <w:color w:val="334155"/>
+                <w:sz w:val="19"/>
+                <w:szCs w:val="19"/>
+              </w:rPr>
+              <w:t xml:space="preserve">Không vào báo cáo vắng và không tính điểm chuyên cần.</w:t>
+            </w:r>
+          </w:p>
+        </w:tc>
+      </w:tr>
+      <w:tr>
+        <w:trPr/>
+        <w:tc>
+          <w:tcPr>
+            <w:tcW w:w="1700" w:type="dxa"/>
+            <w:noWrap/>
+          </w:tcPr>
+          <w:p>
+            <w:pPr/>
+            <w:r>
+              <w:rPr>
+                <w:rFonts w:ascii="Arial" w:hAnsi="Arial" w:eastAsia="Arial" w:cs="Arial"/>
+                <w:color w:val="334155"/>
+                <w:sz w:val="19"/>
+                <w:szCs w:val="19"/>
+              </w:rPr>
+              <w:t xml:space="preserve">✓ Có mặt</w:t>
+            </w:r>
+          </w:p>
+        </w:tc>
+        <w:tc>
+          <w:tcPr>
+            <w:tcW w:w="3300" w:type="dxa"/>
+            <w:noWrap/>
+          </w:tcPr>
+          <w:p>
+            <w:pPr/>
+            <w:r>
+              <w:rPr>
+                <w:rFonts w:ascii="Arial" w:hAnsi="Arial" w:eastAsia="Arial" w:cs="Arial"/>
+                <w:color w:val="334155"/>
+                <w:sz w:val="19"/>
+                <w:szCs w:val="19"/>
+              </w:rPr>
+              <w:t xml:space="preserve">Học sinh tham dự.</w:t>
+            </w:r>
+          </w:p>
+        </w:tc>
+        <w:tc>
+          <w:tcPr>
+            <w:tcW w:w="3900" w:type="dxa"/>
+            <w:noWrap/>
+          </w:tcPr>
+          <w:p>
+            <w:pPr/>
+            <w:r>
+              <w:rPr>
+                <w:rFonts w:ascii="Arial" w:hAnsi="Arial" w:eastAsia="Arial" w:cs="Arial"/>
+                <w:color w:val="334155"/>
+                <w:sz w:val="19"/>
+                <w:szCs w:val="19"/>
+              </w:rPr>
+              <w:t xml:space="preserve">Được tính trọn một buổi chuyên cần.</w:t>
+            </w:r>
+          </w:p>
+        </w:tc>
+      </w:tr>
+      <w:tr>
+        <w:trPr/>
+        <w:tc>
+          <w:tcPr>
+            <w:tcW w:w="1700" w:type="dxa"/>
+            <w:noWrap/>
+          </w:tcPr>
+          <w:p>
+            <w:pPr/>
+            <w:r>
+              <w:rPr>
+                <w:rFonts w:ascii="Arial" w:hAnsi="Arial" w:eastAsia="Arial" w:cs="Arial"/>
+                <w:color w:val="334155"/>
+                <w:sz w:val="19"/>
+                <w:szCs w:val="19"/>
+              </w:rPr>
+              <w:t xml:space="preserve">P / CP</w:t>
+            </w:r>
+          </w:p>
+        </w:tc>
+        <w:tc>
+          <w:tcPr>
+            <w:tcW w:w="3300" w:type="dxa"/>
+            <w:noWrap/>
+          </w:tcPr>
+          <w:p>
+            <w:pPr/>
+            <w:r>
+              <w:rPr>
+                <w:rFonts w:ascii="Arial" w:hAnsi="Arial" w:eastAsia="Arial" w:cs="Arial"/>
+                <w:color w:val="334155"/>
+                <w:sz w:val="19"/>
+                <w:szCs w:val="19"/>
+              </w:rPr>
+              <w:t xml:space="preserve">Vắng có phép, có thể kèm lý do.</w:t>
+            </w:r>
+          </w:p>
+        </w:tc>
+        <w:tc>
+          <w:tcPr>
+            <w:tcW w:w="3900" w:type="dxa"/>
+            <w:noWrap/>
+          </w:tcPr>
+          <w:p>
+            <w:pPr/>
+            <w:r>
+              <w:rPr>
+                <w:rFonts w:ascii="Arial" w:hAnsi="Arial" w:eastAsia="Arial" w:cs="Arial"/>
+                <w:color w:val="334155"/>
+                <w:sz w:val="19"/>
+                <w:szCs w:val="19"/>
+              </w:rPr>
+              <w:t xml:space="preserve">Được quy đổi theo tỉ lệ giáo xứ cấu hình.</w:t>
+            </w:r>
+          </w:p>
+        </w:tc>
+      </w:tr>
+      <w:tr>
+        <w:trPr/>
+        <w:tc>
+          <w:tcPr>
+            <w:tcW w:w="1700" w:type="dxa"/>
+            <w:noWrap/>
+          </w:tcPr>
+          <w:p>
+            <w:pPr/>
+            <w:r>
+              <w:rPr>
+                <w:rFonts w:ascii="Arial" w:hAnsi="Arial" w:eastAsia="Arial" w:cs="Arial"/>
+                <w:color w:val="334155"/>
+                <w:sz w:val="19"/>
+                <w:szCs w:val="19"/>
+              </w:rPr>
+              <w:t xml:space="preserve">✕ / KP</w:t>
+            </w:r>
+          </w:p>
+        </w:tc>
+        <w:tc>
+          <w:tcPr>
+            <w:tcW w:w="3300" w:type="dxa"/>
+            <w:noWrap/>
+          </w:tcPr>
+          <w:p>
+            <w:pPr/>
+            <w:r>
+              <w:rPr>
+                <w:rFonts w:ascii="Arial" w:hAnsi="Arial" w:eastAsia="Arial" w:cs="Arial"/>
+                <w:color w:val="334155"/>
+                <w:sz w:val="19"/>
+                <w:szCs w:val="19"/>
+              </w:rPr>
+              <w:t xml:space="preserve">Vắng không phép.</w:t>
+            </w:r>
+          </w:p>
+        </w:tc>
+        <w:tc>
+          <w:tcPr>
+            <w:tcW w:w="3900" w:type="dxa"/>
+            <w:noWrap/>
+          </w:tcPr>
+          <w:p>
+            <w:pPr/>
+            <w:r>
+              <w:rPr>
+                <w:rFonts w:ascii="Arial" w:hAnsi="Arial" w:eastAsia="Arial" w:cs="Arial"/>
+                <w:color w:val="334155"/>
+                <w:sz w:val="19"/>
+                <w:szCs w:val="19"/>
+              </w:rPr>
+              <w:t xml:space="preserve">Vào mẫu số chuyên cần nhưng không được cộng điểm buổi.</w:t>
+            </w:r>
+          </w:p>
+        </w:tc>
+      </w:tr>
+    </w:tbl>
+    <w:p/>
+    <w:p>
+      <w:pPr>
+        <w:pStyle w:val="Heading2"/>
+      </w:pPr>
+      <w:bookmarkStart w:id="42" w:name="_Toc42"/>
+      <w:r>
+        <w:t>10.3. Giờ chốt và KP suy luận</w:t>
+      </w:r>
+      <w:bookmarkEnd w:id="42"/>
+    </w:p>
+    <w:p>
+      <w:pPr>
+        <w:spacing w:after="120" w:line="276" w:lineRule="auto"/>
+      </w:pPr>
+      <w:r>
+        <w:rPr>
+          <w:rFonts w:ascii="Arial" w:hAnsi="Arial" w:eastAsia="Arial" w:cs="Arial"/>
+          <w:sz w:val="21"/>
+          <w:szCs w:val="21"/>
+        </w:rPr>
+        <w:t xml:space="preserve">Giờ chốt mặc định là 20:00 và có thể đổi tại Phiên điểm danh → Cài đặt điểm danh. Giờ này luôn áp dụng khi đọc số liệu; không có công tắc bật/tắt.</w:t>
+      </w:r>
+    </w:p>
+    <w:p>
+      <w:pPr>
+        <w:spacing w:after="120" w:line="276" w:lineRule="auto"/>
+      </w:pPr>
+      <w:r>
+        <w:rPr>
+          <w:rFonts w:ascii="Arial" w:hAnsi="Arial" w:eastAsia="Arial" w:cs="Arial"/>
+          <w:sz w:val="21"/>
+          <w:szCs w:val="21"/>
+        </w:rPr>
+        <w:t xml:space="preserve">Một học sinh chưa có bản ghi được suy luận là vắng không phép (KP) khi cả hai điều kiện sau đúng:</w:t>
+      </w:r>
+    </w:p>
+    <w:p>
+      <w:pPr>
+        <w:spacing w:after="60" w:line="264" w:lineRule="auto"/>
+        <w:numPr>
+          <w:ilvl w:val="0"/>
+          <w:numId w:val="6"/>
+        </w:numPr>
+      </w:pPr>
+      <w:r>
+        <w:rPr>
+          <w:rFonts w:ascii="Arial" w:hAnsi="Arial" w:eastAsia="Arial" w:cs="Arial"/>
+          <w:sz w:val="21"/>
+          <w:szCs w:val="21"/>
+        </w:rPr>
+        <w:t xml:space="preserve">Buổi đã có ít nhất một học sinh được điểm danh hợp lệ (có mặt / CP / KP thật).</w:t>
+      </w:r>
+    </w:p>
+    <w:p>
+      <w:pPr>
+        <w:spacing w:after="60" w:line="264" w:lineRule="auto"/>
+        <w:numPr>
+          <w:ilvl w:val="0"/>
+          <w:numId w:val="6"/>
+        </w:numPr>
+      </w:pPr>
+      <w:r>
+        <w:rPr>
+          <w:rFonts w:ascii="Arial" w:hAnsi="Arial" w:eastAsia="Arial" w:cs="Arial"/>
+          <w:sz w:val="21"/>
+          <w:szCs w:val="21"/>
+        </w:rPr>
+        <w:t xml:space="preserve">Buổi đã khóa, hoặc đã qua giờ chốt của chính ngày buổi đó.</w:t>
+      </w:r>
+    </w:p>
+    <w:tbl>
+      <w:tblGrid>
+        <w:gridCol w:w="4800" w:type="dxa"/>
+        <w:gridCol w:w="4100" w:type="dxa"/>
+      </w:tblGrid>
+      <w:tblPr>
+        <w:tblW w:w="5000" w:type="pct"/>
+        <w:tblLayout w:type="autofit"/>
+        <w:tblCellMar>
+          <w:top w:w="80" w:type="dxa"/>
+          <w:left w:w="80" w:type="dxa"/>
+          <w:right w:w="80" w:type="dxa"/>
+          <w:bottom w:w="80" w:type="dxa"/>
+        </w:tblCellMar>
+        <w:tblBorders>
+          <w:top w:val="single" w:sz="4" w:color="CBD5E1"/>
+          <w:left w:val="single" w:sz="4" w:color="CBD5E1"/>
+          <w:right w:val="single" w:sz="4" w:color="CBD5E1"/>
+          <w:bottom w:val="single" w:sz="4" w:color="CBD5E1"/>
+          <w:insideH w:val="single" w:sz="4" w:color="CBD5E1"/>
+          <w:insideV w:val="single" w:sz="4" w:color="CBD5E1"/>
+        </w:tblBorders>
+      </w:tblPr>
+      <w:tr>
+        <w:trPr/>
+        <w:tc>
+          <w:tcPr>
+            <w:tcW w:w="4800" w:type="dxa"/>
+            <w:shd w:val="clear" w:fill="E2E8F0"/>
+            <w:noWrap/>
+          </w:tcPr>
+          <w:p>
+            <w:pPr/>
+            <w:r>
+              <w:rPr>
+                <w:rFonts w:ascii="Arial" w:hAnsi="Arial" w:eastAsia="Arial" w:cs="Arial"/>
+                <w:color w:val="334155"/>
+                <w:sz w:val="19"/>
+                <w:szCs w:val="19"/>
+                <w:b w:val="1"/>
+                <w:bCs w:val="1"/>
+              </w:rPr>
+              <w:t xml:space="preserve">Tình huống</w:t>
+            </w:r>
+          </w:p>
+        </w:tc>
+        <w:tc>
+          <w:tcPr>
+            <w:tcW w:w="4100" w:type="dxa"/>
+            <w:shd w:val="clear" w:fill="E2E8F0"/>
+            <w:noWrap/>
+          </w:tcPr>
+          <w:p>
+            <w:pPr/>
+            <w:r>
+              <w:rPr>
+                <w:rFonts w:ascii="Arial" w:hAnsi="Arial" w:eastAsia="Arial" w:cs="Arial"/>
+                <w:color w:val="334155"/>
+                <w:sz w:val="19"/>
+                <w:szCs w:val="19"/>
+                <w:b w:val="1"/>
+                <w:bCs w:val="1"/>
+              </w:rPr>
+              <w:t xml:space="preserve">Kết quả ô chưa điểm danh</w:t>
+            </w:r>
+          </w:p>
+        </w:tc>
+      </w:tr>
+      <w:tr>
+        <w:trPr/>
+        <w:tc>
+          <w:tcPr>
+            <w:tcW w:w="4800" w:type="dxa"/>
+            <w:noWrap/>
+          </w:tcPr>
+          <w:p>
+            <w:pPr/>
+            <w:r>
+              <w:rPr>
+                <w:rFonts w:ascii="Arial" w:hAnsi="Arial" w:eastAsia="Arial" w:cs="Arial"/>
+                <w:color w:val="334155"/>
+                <w:sz w:val="19"/>
+                <w:szCs w:val="19"/>
+              </w:rPr>
+              <w:t xml:space="preserve">Chưa khóa và chưa tới giờ chốt ngày buổi đó</w:t>
+            </w:r>
+          </w:p>
+        </w:tc>
+        <w:tc>
+          <w:tcPr>
+            <w:tcW w:w="4100" w:type="dxa"/>
+            <w:noWrap/>
+          </w:tcPr>
+          <w:p>
+            <w:pPr/>
+            <w:r>
+              <w:rPr>
+                <w:rFonts w:ascii="Arial" w:hAnsi="Arial" w:eastAsia="Arial" w:cs="Arial"/>
+                <w:color w:val="334155"/>
+                <w:sz w:val="19"/>
+                <w:szCs w:val="19"/>
+              </w:rPr>
+              <w:t xml:space="preserve">Chưa điểm danh; chưa tính chuyên cần.</w:t>
+            </w:r>
+          </w:p>
+        </w:tc>
+      </w:tr>
+      <w:tr>
+        <w:trPr/>
+        <w:tc>
+          <w:tcPr>
+            <w:tcW w:w="4800" w:type="dxa"/>
+            <w:noWrap/>
+          </w:tcPr>
+          <w:p>
+            <w:pPr/>
+            <w:r>
+              <w:rPr>
+                <w:rFonts w:ascii="Arial" w:hAnsi="Arial" w:eastAsia="Arial" w:cs="Arial"/>
+                <w:color w:val="334155"/>
+                <w:sz w:val="19"/>
+                <w:szCs w:val="19"/>
+              </w:rPr>
+              <w:t xml:space="preserve">Đã qua giờ chốt, buổi đã có ít nhất một em được điểm</w:t>
+            </w:r>
+          </w:p>
+        </w:tc>
+        <w:tc>
+          <w:tcPr>
+            <w:tcW w:w="4100" w:type="dxa"/>
+            <w:noWrap/>
+          </w:tcPr>
+          <w:p>
+            <w:pPr/>
+            <w:r>
+              <w:rPr>
+                <w:rFonts w:ascii="Arial" w:hAnsi="Arial" w:eastAsia="Arial" w:cs="Arial"/>
+                <w:color w:val="334155"/>
+                <w:sz w:val="19"/>
+                <w:szCs w:val="19"/>
+              </w:rPr>
+              <w:t xml:space="preserve">KP suy luận.</w:t>
+            </w:r>
+          </w:p>
+        </w:tc>
+      </w:tr>
+      <w:tr>
+        <w:trPr/>
+        <w:tc>
+          <w:tcPr>
+            <w:tcW w:w="4800" w:type="dxa"/>
+            <w:noWrap/>
+          </w:tcPr>
+          <w:p>
+            <w:pPr/>
+            <w:r>
+              <w:rPr>
+                <w:rFonts w:ascii="Arial" w:hAnsi="Arial" w:eastAsia="Arial" w:cs="Arial"/>
+                <w:color w:val="334155"/>
+                <w:sz w:val="19"/>
+                <w:szCs w:val="19"/>
+              </w:rPr>
+              <w:t xml:space="preserve">Đã khóa, buổi đã có ít nhất một em được điểm</w:t>
+            </w:r>
+          </w:p>
+        </w:tc>
+        <w:tc>
+          <w:tcPr>
+            <w:tcW w:w="4100" w:type="dxa"/>
+            <w:noWrap/>
+          </w:tcPr>
+          <w:p>
+            <w:pPr/>
+            <w:r>
+              <w:rPr>
+                <w:rFonts w:ascii="Arial" w:hAnsi="Arial" w:eastAsia="Arial" w:cs="Arial"/>
+                <w:color w:val="334155"/>
+                <w:sz w:val="19"/>
+                <w:szCs w:val="19"/>
+              </w:rPr>
+              <w:t xml:space="preserve">KP suy luận ngay, không cần đợi giờ chốt.</w:t>
+            </w:r>
+          </w:p>
+        </w:tc>
+      </w:tr>
+      <w:tr>
+        <w:trPr/>
+        <w:tc>
+          <w:tcPr>
+            <w:tcW w:w="4800" w:type="dxa"/>
+            <w:noWrap/>
+          </w:tcPr>
+          <w:p>
+            <w:pPr/>
+            <w:r>
+              <w:rPr>
+                <w:rFonts w:ascii="Arial" w:hAnsi="Arial" w:eastAsia="Arial" w:cs="Arial"/>
+                <w:color w:val="334155"/>
+                <w:sz w:val="19"/>
+                <w:szCs w:val="19"/>
+              </w:rPr>
+              <w:t xml:space="preserve">Cả lớp chưa ai được điểm danh</w:t>
+            </w:r>
+          </w:p>
+        </w:tc>
+        <w:tc>
+          <w:tcPr>
+            <w:tcW w:w="4100" w:type="dxa"/>
+            <w:noWrap/>
+          </w:tcPr>
+          <w:p>
+            <w:pPr/>
+            <w:r>
+              <w:rPr>
+                <w:rFonts w:ascii="Arial" w:hAnsi="Arial" w:eastAsia="Arial" w:cs="Arial"/>
+                <w:color w:val="334155"/>
+                <w:sz w:val="19"/>
+                <w:szCs w:val="19"/>
+              </w:rPr>
+              <w:t xml:space="preserve">Không suy KP; hiển thị cảnh báo để tránh trừ oan.</w:t>
+            </w:r>
+          </w:p>
+        </w:tc>
+      </w:tr>
+      <w:tr>
+        <w:trPr/>
+        <w:tc>
+          <w:tcPr>
+            <w:tcW w:w="4800" w:type="dxa"/>
+            <w:noWrap/>
+          </w:tcPr>
+          <w:p>
+            <w:pPr/>
+            <w:r>
+              <w:rPr>
+                <w:rFonts w:ascii="Arial" w:hAnsi="Arial" w:eastAsia="Arial" w:cs="Arial"/>
+                <w:color w:val="334155"/>
+                <w:sz w:val="19"/>
+                <w:szCs w:val="19"/>
+              </w:rPr>
+              <w:t xml:space="preserve">Buổi đã hủy</w:t>
+            </w:r>
+          </w:p>
+        </w:tc>
+        <w:tc>
+          <w:tcPr>
+            <w:tcW w:w="4100" w:type="dxa"/>
+            <w:noWrap/>
+          </w:tcPr>
+          <w:p>
+            <w:pPr/>
+            <w:r>
+              <w:rPr>
+                <w:rFonts w:ascii="Arial" w:hAnsi="Arial" w:eastAsia="Arial" w:cs="Arial"/>
+                <w:color w:val="334155"/>
+                <w:sz w:val="19"/>
+                <w:szCs w:val="19"/>
+              </w:rPr>
+              <w:t xml:space="preserve">Bỏ qua hoàn toàn.</w:t>
+            </w:r>
+          </w:p>
+        </w:tc>
+      </w:tr>
+    </w:tbl>
+    <w:p/>
+    <w:tbl>
+      <w:tblGrid>
+        <w:gridCol/>
+      </w:tblGrid>
+      <w:tblPr>
+        <w:tblW w:w="5000" w:type="pct"/>
+        <w:tblLayout w:type="autofit"/>
+        <w:tblCellMar>
+          <w:top w:w="100" w:type="dxa"/>
+          <w:left w:w="100" w:type="dxa"/>
+          <w:right w:w="100" w:type="dxa"/>
+          <w:bottom w:w="100" w:type="dxa"/>
+        </w:tblCellMar>
+        <w:tblBorders>
+          <w:top w:val="single" w:sz="6" w:color="F59E0B"/>
+          <w:left w:val="single" w:sz="6" w:color="F59E0B"/>
+          <w:right w:val="single" w:sz="6" w:color="F59E0B"/>
+          <w:bottom w:val="single" w:sz="6" w:color="F59E0B"/>
+          <w:insideH w:val="single" w:sz="6" w:color="F59E0B"/>
+          <w:insideV w:val="single" w:sz="6" w:color="F59E0B"/>
+        </w:tblBorders>
+      </w:tblPr>
+      <w:tr>
+        <w:trPr/>
+        <w:tc>
+          <w:tcPr>
+            <w:shd w:val="clear" w:fill="FFF7ED"/>
+            <w:noWrap/>
+          </w:tcPr>
+          <w:p>
+            <w:pPr>
+              <w:spacing w:after="0" w:line="264" w:lineRule="auto"/>
+            </w:pPr>
+            <w:r>
+              <w:rPr>
+                <w:rFonts w:ascii="Arial" w:hAnsi="Arial" w:eastAsia="Arial" w:cs="Arial"/>
+                <w:color w:val="9A3412"/>
+                <w:sz w:val="20"/>
+                <w:szCs w:val="20"/>
+                <w:b w:val="1"/>
+                <w:bCs w:val="1"/>
+              </w:rPr>
+              <w:t xml:space="preserve">Quan trọng: </w:t>
+            </w:r>
+            <w:r>
+              <w:rPr>
+                <w:rFonts w:ascii="Arial" w:hAnsi="Arial" w:eastAsia="Arial" w:cs="Arial"/>
+                <w:color w:val="7C2D12"/>
+                <w:sz w:val="20"/>
+                <w:szCs w:val="20"/>
+              </w:rPr>
+              <w:t xml:space="preserve">KP suy luận chỉ được tính khi xem lưới, báo cáo, Excel và điểm chuyên cần; hệ thống không tự tạo AttendanceRecord trong database. Nếu buổi còn mở, có thể điểm danh bù và lưu trạng thái đúng.</w:t>
+            </w:r>
+          </w:p>
+        </w:tc>
+      </w:tr>
+    </w:tbl>
+    <w:p/>
+    <w:p>
+      <w:pPr>
+        <w:pStyle w:val="Heading2"/>
+      </w:pPr>
+      <w:bookmarkStart w:id="43" w:name="_Toc43"/>
+      <w:r>
+        <w:t>10.4. Buổi chưa ai điểm danh</w:t>
+      </w:r>
+      <w:bookmarkEnd w:id="43"/>
+    </w:p>
+    <w:p>
+      <w:pPr>
+        <w:spacing w:after="120" w:line="276" w:lineRule="auto"/>
+      </w:pPr>
+      <w:r>
+        <w:rPr>
+          <w:rFonts w:ascii="Arial" w:hAnsi="Arial" w:eastAsia="Arial" w:cs="Arial"/>
+          <w:sz w:val="21"/>
+          <w:szCs w:val="21"/>
+        </w:rPr>
+        <w:t xml:space="preserve">“Chưa ai điểm danh” nghĩa là cả lớp không có bất kỳ bản ghi hợp lệ nào trong buổi đó. Buổi này không vào mẫu số chuyên cần, kể cả đã qua ngày, nhằm tránh trừ oan khi GLV quên điểm hoặc buổi chưa diễn ra.</w:t>
+      </w:r>
+    </w:p>
+    <w:p>
+      <w:pPr>
+        <w:spacing w:after="60" w:line="264" w:lineRule="auto"/>
+        <w:numPr>
+          <w:ilvl w:val="0"/>
+          <w:numId w:val="6"/>
+        </w:numPr>
+      </w:pPr>
+      <w:r>
+        <w:rPr>
+          <w:rFonts w:ascii="Arial" w:hAnsi="Arial" w:eastAsia="Arial" w:cs="Arial"/>
+          <w:sz w:val="21"/>
+          <w:szCs w:val="21"/>
+        </w:rPr>
+        <w:t xml:space="preserve">Nếu lớp thực sự đã học: kiểm tra và hoàn tất điểm danh.</w:t>
+      </w:r>
+    </w:p>
+    <w:p>
+      <w:pPr>
+        <w:spacing w:after="60" w:line="264" w:lineRule="auto"/>
+        <w:numPr>
+          <w:ilvl w:val="0"/>
+          <w:numId w:val="6"/>
+        </w:numPr>
+      </w:pPr>
+      <w:r>
+        <w:rPr>
+          <w:rFonts w:ascii="Arial" w:hAnsi="Arial" w:eastAsia="Arial" w:cs="Arial"/>
+          <w:sz w:val="21"/>
+          <w:szCs w:val="21"/>
+        </w:rPr>
+        <w:t xml:space="preserve">Nếu lớp nghỉ: hủy buổi tại Phiên điểm danh.</w:t>
+      </w:r>
+    </w:p>
+    <w:p>
+      <w:pPr>
+        <w:spacing w:after="60" w:line="264" w:lineRule="auto"/>
+        <w:numPr>
+          <w:ilvl w:val="0"/>
+          <w:numId w:val="6"/>
+        </w:numPr>
+      </w:pPr>
+      <w:r>
+        <w:rPr>
+          <w:rFonts w:ascii="Arial" w:hAnsi="Arial" w:eastAsia="Arial" w:cs="Arial"/>
+          <w:sz w:val="21"/>
+          <w:szCs w:val="21"/>
+        </w:rPr>
+        <w:t xml:space="preserve">Trang Điểm danh sẽ cảnh báo các buổi đã khóa / qua giờ chốt nhưng chưa ai được điểm.</w:t>
+      </w:r>
+    </w:p>
+    <w:p>
+      <w:pPr>
+        <w:pStyle w:val="Heading2"/>
+      </w:pPr>
+      <w:bookmarkStart w:id="44" w:name="_Toc44"/>
+      <w:r>
+        <w:t>10.5. Xuất Excel điểm danh</w:t>
+      </w:r>
+      <w:bookmarkEnd w:id="44"/>
+    </w:p>
+    <w:p>
+      <w:pPr>
+        <w:spacing w:after="60" w:line="264" w:lineRule="auto"/>
+        <w:numPr>
+          <w:ilvl w:val="0"/>
+          <w:numId w:val="6"/>
+        </w:numPr>
+      </w:pPr>
+      <w:r>
+        <w:rPr>
+          <w:rFonts w:ascii="Arial" w:hAnsi="Arial" w:eastAsia="Arial" w:cs="Arial"/>
+          <w:sz w:val="21"/>
+          <w:szCs w:val="21"/>
+        </w:rPr>
+        <w:t xml:space="preserve">Bảng điểm danh: xuất đầy đủ học sinh và buổi trong khoảng lọc, dùng trạng thái hiệu lực (bao gồm KP suy luận).</w:t>
+      </w:r>
+    </w:p>
+    <w:p>
+      <w:pPr>
+        <w:spacing w:after="60" w:line="264" w:lineRule="auto"/>
+        <w:numPr>
+          <w:ilvl w:val="0"/>
+          <w:numId w:val="6"/>
+        </w:numPr>
+      </w:pPr>
+      <w:r>
+        <w:rPr>
+          <w:rFonts w:ascii="Arial" w:hAnsi="Arial" w:eastAsia="Arial" w:cs="Arial"/>
+          <w:sz w:val="21"/>
+          <w:szCs w:val="21"/>
+        </w:rPr>
+        <w:t xml:space="preserve">Danh sách học sinh vắng: chỉ liệt kê học sinh có CP/KP và chỉ giữ những buổi có ít nhất một CP/KP.</w:t>
+      </w:r>
+    </w:p>
+    <w:p>
+      <w:pPr>
+        <w:spacing w:after="60" w:line="264" w:lineRule="auto"/>
+        <w:numPr>
+          <w:ilvl w:val="0"/>
+          <w:numId w:val="6"/>
+        </w:numPr>
+      </w:pPr>
+      <w:r>
+        <w:rPr>
+          <w:rFonts w:ascii="Arial" w:hAnsi="Arial" w:eastAsia="Arial" w:cs="Arial"/>
+          <w:sz w:val="21"/>
+          <w:szCs w:val="21"/>
+        </w:rPr>
+        <w:t xml:space="preserve">Buổi chưa tới giờ chốt chỉ có ô chưa điểm danh không được xem là buổi vắng.</w:t>
+      </w:r>
+    </w:p>
+    <w:p>
+      <w:pPr>
+        <w:spacing w:after="60" w:line="264" w:lineRule="auto"/>
+        <w:numPr>
+          <w:ilvl w:val="0"/>
+          <w:numId w:val="6"/>
+        </w:numPr>
+      </w:pPr>
+      <w:r>
+        <w:rPr>
+          <w:rFonts w:ascii="Arial" w:hAnsi="Arial" w:eastAsia="Arial" w:cs="Arial"/>
+          <w:sz w:val="21"/>
+          <w:szCs w:val="21"/>
+        </w:rPr>
+        <w:t xml:space="preserve">Buổi hủy không được tính.</w:t>
+      </w:r>
+    </w:p>
+    <w:p>
+      <w:pPr>
+        <w:pStyle w:val="Heading1"/>
+      </w:pPr>
+      <w:bookmarkStart w:id="45" w:name="_Toc45"/>
+      <w:r>
+        <w:t>11. Hướng dẫn chi tiết điểm học tập</w:t>
+      </w:r>
+      <w:bookmarkEnd w:id="45"/>
+    </w:p>
+    <w:p>
+      <w:pPr>
+        <w:pStyle w:val="Heading2"/>
+      </w:pPr>
+      <w:bookmarkStart w:id="46" w:name="_Toc46"/>
+      <w:r>
+        <w:t>11.1. Quyền và các tab</w:t>
+      </w:r>
+      <w:bookmarkEnd w:id="46"/>
+    </w:p>
+    <w:p>
+      <w:pPr>
+        <w:spacing w:after="60" w:line="264" w:lineRule="auto"/>
+        <w:numPr>
+          <w:ilvl w:val="0"/>
+          <w:numId w:val="6"/>
+        </w:numPr>
+      </w:pPr>
+      <w:r>
+        <w:rPr>
+          <w:rFonts w:ascii="Arial" w:hAnsi="Arial" w:eastAsia="Arial" w:cs="Arial"/>
+          <w:sz w:val="21"/>
+          <w:szCs w:val="21"/>
+        </w:rPr>
+        <w:t xml:space="preserve">Quản trị xứ / Quản trị giáo lý: nhập, sửa điểm; cấu hình loại điểm và cách tính.</w:t>
+      </w:r>
+    </w:p>
+    <w:p>
+      <w:pPr>
+        <w:spacing w:after="60" w:line="264" w:lineRule="auto"/>
+        <w:numPr>
+          <w:ilvl w:val="0"/>
+          <w:numId w:val="6"/>
+        </w:numPr>
+      </w:pPr>
+      <w:r>
+        <w:rPr>
+          <w:rFonts w:ascii="Arial" w:hAnsi="Arial" w:eastAsia="Arial" w:cs="Arial"/>
+          <w:sz w:val="21"/>
+          <w:szCs w:val="21"/>
+        </w:rPr>
+        <w:t xml:space="preserve">GLV thuần: chỉ xem điểm lớp được phân công.</w:t>
+      </w:r>
+    </w:p>
+    <w:p>
+      <w:pPr>
+        <w:spacing w:after="60" w:line="264" w:lineRule="auto"/>
+        <w:numPr>
+          <w:ilvl w:val="0"/>
+          <w:numId w:val="6"/>
+        </w:numPr>
+      </w:pPr>
+      <w:r>
+        <w:rPr>
+          <w:rFonts w:ascii="Arial" w:hAnsi="Arial" w:eastAsia="Arial" w:cs="Arial"/>
+          <w:sz w:val="21"/>
+          <w:szCs w:val="21"/>
+        </w:rPr>
+        <w:t xml:space="preserve">GLV có quyền “Quản lý điểm toàn giáo xứ”: nhập/sửa điểm mọi lớp, với điều kiện đang có ít nhất một phân công trong năm học hiện tại.</w:t>
+      </w:r>
+    </w:p>
+    <w:p>
+      <w:pPr>
+        <w:spacing w:after="60" w:line="264" w:lineRule="auto"/>
+        <w:numPr>
+          <w:ilvl w:val="0"/>
+          <w:numId w:val="6"/>
+        </w:numPr>
+      </w:pPr>
+      <w:r>
+        <w:rPr>
+          <w:rFonts w:ascii="Arial" w:hAnsi="Arial" w:eastAsia="Arial" w:cs="Arial"/>
+          <w:sz w:val="21"/>
+          <w:szCs w:val="21"/>
+        </w:rPr>
+        <w:t xml:space="preserve">Ba tab: Bảng điểm, Cấu hình loại điểm, Cách tính điểm. Hai tab cấu hình chỉ dành cho quản trị.</w:t>
+      </w:r>
+    </w:p>
+    <w:p>
+      <w:pPr>
+        <w:pStyle w:val="Heading2"/>
+      </w:pPr>
+      <w:bookmarkStart w:id="47" w:name="_Toc47"/>
+      <w:r>
+        <w:t>11.2. Loại điểm và trung bình học tập</w:t>
+      </w:r>
+      <w:bookmarkEnd w:id="47"/>
+    </w:p>
+    <w:p>
+      <w:pPr>
+        <w:spacing w:after="120" w:line="276" w:lineRule="auto"/>
+      </w:pPr>
+      <w:r>
+        <w:rPr>
+          <w:rFonts w:ascii="Arial" w:hAnsi="Arial" w:eastAsia="Arial" w:cs="Arial"/>
+          <w:sz w:val="21"/>
+          <w:szCs w:val="21"/>
+        </w:rPr>
+        <w:t xml:space="preserve">Mỗi loại điểm có tên, học kỳ, hệ số, điểm tối đa, thứ tự và trạng thái bật/tắt. Các loại chuẩn gồm khảo kinh, 15 phút, 45 phút, giữa kỳ và cuối kỳ.</w:t>
+      </w:r>
+    </w:p>
+    <w:p>
+      <w:pPr>
+        <w:spacing w:after="120" w:line="276" w:lineRule="auto"/>
+      </w:pPr>
+      <w:r>
+        <w:rPr>
+          <w:rFonts w:ascii="Arial" w:hAnsi="Arial" w:eastAsia="Arial" w:cs="Arial"/>
+          <w:sz w:val="21"/>
+          <w:szCs w:val="21"/>
+        </w:rPr>
+        <w:t xml:space="preserve">TB học tập = Tổng (điểm × hệ số) / Tổng hệ số của các cột đang bật và đã có điểm.</w:t>
+      </w:r>
+    </w:p>
+    <w:p>
+      <w:pPr>
+        <w:spacing w:after="60" w:line="264" w:lineRule="auto"/>
+        <w:numPr>
+          <w:ilvl w:val="0"/>
+          <w:numId w:val="6"/>
+        </w:numPr>
+      </w:pPr>
+      <w:r>
+        <w:rPr>
+          <w:rFonts w:ascii="Arial" w:hAnsi="Arial" w:eastAsia="Arial" w:cs="Arial"/>
+          <w:sz w:val="21"/>
+          <w:szCs w:val="21"/>
+        </w:rPr>
+        <w:t xml:space="preserve">Cột đã tắt: loại hoàn toàn khỏi bảng và phép tính.</w:t>
+      </w:r>
+    </w:p>
+    <w:p>
+      <w:pPr>
+        <w:spacing w:after="60" w:line="264" w:lineRule="auto"/>
+        <w:numPr>
+          <w:ilvl w:val="0"/>
+          <w:numId w:val="6"/>
+        </w:numPr>
+      </w:pPr>
+      <w:r>
+        <w:rPr>
+          <w:rFonts w:ascii="Arial" w:hAnsi="Arial" w:eastAsia="Arial" w:cs="Arial"/>
+          <w:sz w:val="21"/>
+          <w:szCs w:val="21"/>
+        </w:rPr>
+        <w:t xml:space="preserve">Cột thường thiếu điểm: bỏ qua cột đó, không vào tử số lẫn mẫu số.</w:t>
+      </w:r>
+    </w:p>
+    <w:p>
+      <w:pPr>
+        <w:spacing w:after="60" w:line="264" w:lineRule="auto"/>
+        <w:numPr>
+          <w:ilvl w:val="0"/>
+          <w:numId w:val="6"/>
+        </w:numPr>
+      </w:pPr>
+      <w:r>
+        <w:rPr>
+          <w:rFonts w:ascii="Arial" w:hAnsi="Arial" w:eastAsia="Arial" w:cs="Arial"/>
+          <w:sz w:val="21"/>
+          <w:szCs w:val="21"/>
+        </w:rPr>
+        <w:t xml:space="preserve">Giữa kỳ hoặc cuối kỳ đang bật mà thiếu điểm: chưa chốt được TB học tập; ô TB hiện “—”.</w:t>
+      </w:r>
+    </w:p>
+    <w:p>
+      <w:pPr>
+        <w:pStyle w:val="Heading2"/>
+      </w:pPr>
+      <w:bookmarkStart w:id="48" w:name="_Toc48"/>
+      <w:r>
+        <w:t>11.3. Cấu hình TB học kỳ và cả năm</w:t>
+      </w:r>
+      <w:bookmarkEnd w:id="48"/>
+    </w:p>
+    <w:p>
+      <w:pPr>
+        <w:spacing w:after="120" w:line="276" w:lineRule="auto"/>
+      </w:pPr>
+      <w:r>
+        <w:rPr>
+          <w:rFonts w:ascii="Arial" w:hAnsi="Arial" w:eastAsia="Arial" w:cs="Arial"/>
+          <w:sz w:val="21"/>
+          <w:szCs w:val="21"/>
+        </w:rPr>
+        <w:t xml:space="preserve">TB học kỳ = TB học tập × %HT + chuyên cần học × %CC học + chuyên cần lễ × %CC lễ.</w:t>
+      </w:r>
+    </w:p>
+    <w:p>
+      <w:pPr>
+        <w:spacing w:after="120" w:line="276" w:lineRule="auto"/>
+      </w:pPr>
+      <w:r>
+        <w:rPr>
+          <w:rFonts w:ascii="Arial" w:hAnsi="Arial" w:eastAsia="Arial" w:cs="Arial"/>
+          <w:sz w:val="21"/>
+          <w:szCs w:val="21"/>
+        </w:rPr>
+        <w:t xml:space="preserve">TB cả năm = TB học kỳ 1 × %HK1 + TB học kỳ 2 × %HK2.</w:t>
+      </w:r>
+    </w:p>
+    <w:p>
+      <w:pPr>
+        <w:spacing w:after="60" w:line="264" w:lineRule="auto"/>
+        <w:numPr>
+          <w:ilvl w:val="0"/>
+          <w:numId w:val="6"/>
+        </w:numPr>
+      </w:pPr>
+      <w:r>
+        <w:rPr>
+          <w:rFonts w:ascii="Arial" w:hAnsi="Arial" w:eastAsia="Arial" w:cs="Arial"/>
+          <w:sz w:val="21"/>
+          <w:szCs w:val="21"/>
+        </w:rPr>
+        <w:t xml:space="preserve">Ba tỉ lệ thành phần học kỳ phải cộng đúng 100%.</w:t>
+      </w:r>
+    </w:p>
+    <w:p>
+      <w:pPr>
+        <w:spacing w:after="60" w:line="264" w:lineRule="auto"/>
+        <w:numPr>
+          <w:ilvl w:val="0"/>
+          <w:numId w:val="6"/>
+        </w:numPr>
+      </w:pPr>
+      <w:r>
+        <w:rPr>
+          <w:rFonts w:ascii="Arial" w:hAnsi="Arial" w:eastAsia="Arial" w:cs="Arial"/>
+          <w:sz w:val="21"/>
+          <w:szCs w:val="21"/>
+        </w:rPr>
+        <w:t xml:space="preserve">Hai tỉ lệ học kỳ phải cộng đúng 100%.</w:t>
+      </w:r>
+    </w:p>
+    <w:p>
+      <w:pPr>
+        <w:spacing w:after="60" w:line="264" w:lineRule="auto"/>
+        <w:numPr>
+          <w:ilvl w:val="0"/>
+          <w:numId w:val="6"/>
+        </w:numPr>
+      </w:pPr>
+      <w:r>
+        <w:rPr>
+          <w:rFonts w:ascii="Arial" w:hAnsi="Arial" w:eastAsia="Arial" w:cs="Arial"/>
+          <w:sz w:val="21"/>
+          <w:szCs w:val="21"/>
+        </w:rPr>
+        <w:t xml:space="preserve">Thành phần có tỉ lệ 0% bị bỏ qua; thiếu dữ liệu không ảnh hưởng.</w:t>
+      </w:r>
+    </w:p>
+    <w:p>
+      <w:pPr>
+        <w:spacing w:after="60" w:line="264" w:lineRule="auto"/>
+        <w:numPr>
+          <w:ilvl w:val="0"/>
+          <w:numId w:val="6"/>
+        </w:numPr>
+      </w:pPr>
+      <w:r>
+        <w:rPr>
+          <w:rFonts w:ascii="Arial" w:hAnsi="Arial" w:eastAsia="Arial" w:cs="Arial"/>
+          <w:sz w:val="21"/>
+          <w:szCs w:val="21"/>
+        </w:rPr>
+        <w:t xml:space="preserve">Thành phần có tỉ lệ lớn hơn 0% mà thiếu dữ liệu làm TB hiện “—” kèm lý do.</w:t>
+      </w:r>
+    </w:p>
+    <w:p>
+      <w:pPr>
+        <w:spacing w:after="60" w:line="264" w:lineRule="auto"/>
+        <w:numPr>
+          <w:ilvl w:val="0"/>
+          <w:numId w:val="6"/>
+        </w:numPr>
+      </w:pPr>
+      <w:r>
+        <w:rPr>
+          <w:rFonts w:ascii="Arial" w:hAnsi="Arial" w:eastAsia="Arial" w:cs="Arial"/>
+          <w:sz w:val="21"/>
+          <w:szCs w:val="21"/>
+        </w:rPr>
+        <w:t xml:space="preserve">TB cả năm chỉ có khi cả hai học kỳ đều đã có TB.</w:t>
+      </w:r>
+    </w:p>
+    <w:p>
+      <w:pPr>
+        <w:spacing w:after="60" w:line="264" w:lineRule="auto"/>
+        <w:numPr>
+          <w:ilvl w:val="0"/>
+          <w:numId w:val="6"/>
+        </w:numPr>
+      </w:pPr>
+      <w:r>
+        <w:rPr>
+          <w:rFonts w:ascii="Arial" w:hAnsi="Arial" w:eastAsia="Arial" w:cs="Arial"/>
+          <w:sz w:val="21"/>
+          <w:szCs w:val="21"/>
+        </w:rPr>
+        <w:t xml:space="preserve">Cấu hình theo năm học; cấu hình riêng một khối được ưu tiên hơn cấu hình toàn giáo xứ.</w:t>
+      </w:r>
+    </w:p>
+    <w:p>
+      <w:pPr>
+        <w:pStyle w:val="Heading2"/>
+      </w:pPr>
+      <w:bookmarkStart w:id="49" w:name="_Toc49"/>
+      <w:r>
+        <w:t>11.4. Điểm chuyên cần</w:t>
+      </w:r>
+      <w:bookmarkEnd w:id="49"/>
+    </w:p>
+    <w:p>
+      <w:pPr>
+        <w:spacing w:after="120" w:line="276" w:lineRule="auto"/>
+      </w:pPr>
+      <w:r>
+        <w:rPr>
+          <w:rFonts w:ascii="Arial" w:hAnsi="Arial" w:eastAsia="Arial" w:cs="Arial"/>
+          <w:sz w:val="21"/>
+          <w:szCs w:val="21"/>
+        </w:rPr>
+        <w:t xml:space="preserve">Điểm chuyên cần = 10 × (số buổi có mặt + tỉ lệ quy đổi × số buổi vắng có phép) / số buổi đã điểm danh. Tính riêng chuyên cần học và chuyên cần lễ theo từng học kỳ; làm tròn một chữ số thập phân.</w:t>
+      </w:r>
+    </w:p>
+    <w:tbl>
+      <w:tblGrid>
+        <w:gridCol w:w="3300" w:type="dxa"/>
+        <w:gridCol w:w="1800" w:type="dxa"/>
+        <w:gridCol w:w="3800" w:type="dxa"/>
+      </w:tblGrid>
+      <w:tblPr>
+        <w:tblW w:w="5000" w:type="pct"/>
+        <w:tblLayout w:type="autofit"/>
+        <w:tblCellMar>
+          <w:top w:w="80" w:type="dxa"/>
+          <w:left w:w="80" w:type="dxa"/>
+          <w:right w:w="80" w:type="dxa"/>
+          <w:bottom w:w="80" w:type="dxa"/>
+        </w:tblCellMar>
+        <w:tblBorders>
+          <w:top w:val="single" w:sz="4" w:color="CBD5E1"/>
+          <w:left w:val="single" w:sz="4" w:color="CBD5E1"/>
+          <w:right w:val="single" w:sz="4" w:color="CBD5E1"/>
+          <w:bottom w:val="single" w:sz="4" w:color="CBD5E1"/>
+          <w:insideH w:val="single" w:sz="4" w:color="CBD5E1"/>
+          <w:insideV w:val="single" w:sz="4" w:color="CBD5E1"/>
+        </w:tblBorders>
+      </w:tblPr>
+      <w:tr>
+        <w:trPr/>
+        <w:tc>
+          <w:tcPr>
+            <w:tcW w:w="3300" w:type="dxa"/>
+            <w:shd w:val="clear" w:fill="E2E8F0"/>
+            <w:noWrap/>
+          </w:tcPr>
+          <w:p>
+            <w:pPr/>
+            <w:r>
+              <w:rPr>
+                <w:rFonts w:ascii="Arial" w:hAnsi="Arial" w:eastAsia="Arial" w:cs="Arial"/>
+                <w:color w:val="334155"/>
+                <w:sz w:val="19"/>
+                <w:szCs w:val="19"/>
+                <w:b w:val="1"/>
+                <w:bCs w:val="1"/>
+              </w:rPr>
+              <w:t xml:space="preserve">Trạng thái hiệu lực</w:t>
+            </w:r>
+          </w:p>
+        </w:tc>
+        <w:tc>
+          <w:tcPr>
+            <w:tcW w:w="1800" w:type="dxa"/>
+            <w:shd w:val="clear" w:fill="E2E8F0"/>
+            <w:noWrap/>
+          </w:tcPr>
+          <w:p>
+            <w:pPr/>
+            <w:r>
+              <w:rPr>
+                <w:rFonts w:ascii="Arial" w:hAnsi="Arial" w:eastAsia="Arial" w:cs="Arial"/>
+                <w:color w:val="334155"/>
+                <w:sz w:val="19"/>
+                <w:szCs w:val="19"/>
+                <w:b w:val="1"/>
+                <w:bCs w:val="1"/>
+              </w:rPr>
+              <w:t xml:space="preserve">Vào mẫu số?</w:t>
+            </w:r>
+          </w:p>
+        </w:tc>
+        <w:tc>
+          <w:tcPr>
+            <w:tcW w:w="3800" w:type="dxa"/>
+            <w:shd w:val="clear" w:fill="E2E8F0"/>
+            <w:noWrap/>
+          </w:tcPr>
+          <w:p>
+            <w:pPr/>
+            <w:r>
+              <w:rPr>
+                <w:rFonts w:ascii="Arial" w:hAnsi="Arial" w:eastAsia="Arial" w:cs="Arial"/>
+                <w:color w:val="334155"/>
+                <w:sz w:val="19"/>
+                <w:szCs w:val="19"/>
+                <w:b w:val="1"/>
+                <w:bCs w:val="1"/>
+              </w:rPr>
+              <w:t xml:space="preserve">Giá trị được cộng</w:t>
+            </w:r>
+          </w:p>
+        </w:tc>
+      </w:tr>
+      <w:tr>
+        <w:trPr/>
+        <w:tc>
+          <w:tcPr>
+            <w:tcW w:w="3300" w:type="dxa"/>
+            <w:noWrap/>
+          </w:tcPr>
+          <w:p>
+            <w:pPr/>
+            <w:r>
+              <w:rPr>
+                <w:rFonts w:ascii="Arial" w:hAnsi="Arial" w:eastAsia="Arial" w:cs="Arial"/>
+                <w:color w:val="334155"/>
+                <w:sz w:val="19"/>
+                <w:szCs w:val="19"/>
+              </w:rPr>
+              <w:t xml:space="preserve">Có mặt (✓)</w:t>
+            </w:r>
+          </w:p>
+        </w:tc>
+        <w:tc>
+          <w:tcPr>
+            <w:tcW w:w="1800" w:type="dxa"/>
+            <w:noWrap/>
+          </w:tcPr>
+          <w:p>
+            <w:pPr/>
+            <w:r>
+              <w:rPr>
+                <w:rFonts w:ascii="Arial" w:hAnsi="Arial" w:eastAsia="Arial" w:cs="Arial"/>
+                <w:color w:val="334155"/>
+                <w:sz w:val="19"/>
+                <w:szCs w:val="19"/>
+              </w:rPr>
+              <w:t xml:space="preserve">Có</w:t>
+            </w:r>
+          </w:p>
+        </w:tc>
+        <w:tc>
+          <w:tcPr>
+            <w:tcW w:w="3800" w:type="dxa"/>
+            <w:noWrap/>
+          </w:tcPr>
+          <w:p>
+            <w:pPr/>
+            <w:r>
+              <w:rPr>
+                <w:rFonts w:ascii="Arial" w:hAnsi="Arial" w:eastAsia="Arial" w:cs="Arial"/>
+                <w:color w:val="334155"/>
+                <w:sz w:val="19"/>
+                <w:szCs w:val="19"/>
+              </w:rPr>
+              <w:t xml:space="preserve">1 buổi</w:t>
+            </w:r>
+          </w:p>
+        </w:tc>
+      </w:tr>
+      <w:tr>
+        <w:trPr/>
+        <w:tc>
+          <w:tcPr>
+            <w:tcW w:w="3300" w:type="dxa"/>
+            <w:noWrap/>
+          </w:tcPr>
+          <w:p>
+            <w:pPr/>
+            <w:r>
+              <w:rPr>
+                <w:rFonts w:ascii="Arial" w:hAnsi="Arial" w:eastAsia="Arial" w:cs="Arial"/>
+                <w:color w:val="334155"/>
+                <w:sz w:val="19"/>
+                <w:szCs w:val="19"/>
+              </w:rPr>
+              <w:t xml:space="preserve">Vắng có phép (P/CP)</w:t>
+            </w:r>
+          </w:p>
+        </w:tc>
+        <w:tc>
+          <w:tcPr>
+            <w:tcW w:w="1800" w:type="dxa"/>
+            <w:noWrap/>
+          </w:tcPr>
+          <w:p>
+            <w:pPr/>
+            <w:r>
+              <w:rPr>
+                <w:rFonts w:ascii="Arial" w:hAnsi="Arial" w:eastAsia="Arial" w:cs="Arial"/>
+                <w:color w:val="334155"/>
+                <w:sz w:val="19"/>
+                <w:szCs w:val="19"/>
+              </w:rPr>
+              <w:t xml:space="preserve">Có</w:t>
+            </w:r>
+          </w:p>
+        </w:tc>
+        <w:tc>
+          <w:tcPr>
+            <w:tcW w:w="3800" w:type="dxa"/>
+            <w:noWrap/>
+          </w:tcPr>
+          <w:p>
+            <w:pPr/>
+            <w:r>
+              <w:rPr>
+                <w:rFonts w:ascii="Arial" w:hAnsi="Arial" w:eastAsia="Arial" w:cs="Arial"/>
+                <w:color w:val="334155"/>
+                <w:sz w:val="19"/>
+                <w:szCs w:val="19"/>
+              </w:rPr>
+              <w:t xml:space="preserve">Theo tỉ lệ quy đổi, ví dụ 50% = 0,5 buổi</w:t>
+            </w:r>
+          </w:p>
+        </w:tc>
+      </w:tr>
+      <w:tr>
+        <w:trPr/>
+        <w:tc>
+          <w:tcPr>
+            <w:tcW w:w="3300" w:type="dxa"/>
+            <w:noWrap/>
+          </w:tcPr>
+          <w:p>
+            <w:pPr/>
+            <w:r>
+              <w:rPr>
+                <w:rFonts w:ascii="Arial" w:hAnsi="Arial" w:eastAsia="Arial" w:cs="Arial"/>
+                <w:color w:val="334155"/>
+                <w:sz w:val="19"/>
+                <w:szCs w:val="19"/>
+              </w:rPr>
+              <w:t xml:space="preserve">Vắng không phép / KP suy luận</w:t>
+            </w:r>
+          </w:p>
+        </w:tc>
+        <w:tc>
+          <w:tcPr>
+            <w:tcW w:w="1800" w:type="dxa"/>
+            <w:noWrap/>
+          </w:tcPr>
+          <w:p>
+            <w:pPr/>
+            <w:r>
+              <w:rPr>
+                <w:rFonts w:ascii="Arial" w:hAnsi="Arial" w:eastAsia="Arial" w:cs="Arial"/>
+                <w:color w:val="334155"/>
+                <w:sz w:val="19"/>
+                <w:szCs w:val="19"/>
+              </w:rPr>
+              <w:t xml:space="preserve">Có</w:t>
+            </w:r>
+          </w:p>
+        </w:tc>
+        <w:tc>
+          <w:tcPr>
+            <w:tcW w:w="3800" w:type="dxa"/>
+            <w:noWrap/>
+          </w:tcPr>
+          <w:p>
+            <w:pPr/>
+            <w:r>
+              <w:rPr>
+                <w:rFonts w:ascii="Arial" w:hAnsi="Arial" w:eastAsia="Arial" w:cs="Arial"/>
+                <w:color w:val="334155"/>
+                <w:sz w:val="19"/>
+                <w:szCs w:val="19"/>
+              </w:rPr>
+              <w:t xml:space="preserve">0</w:t>
+            </w:r>
+          </w:p>
+        </w:tc>
+      </w:tr>
+      <w:tr>
+        <w:trPr/>
+        <w:tc>
+          <w:tcPr>
+            <w:tcW w:w="3300" w:type="dxa"/>
+            <w:noWrap/>
+          </w:tcPr>
+          <w:p>
+            <w:pPr/>
+            <w:r>
+              <w:rPr>
+                <w:rFonts w:ascii="Arial" w:hAnsi="Arial" w:eastAsia="Arial" w:cs="Arial"/>
+                <w:color w:val="334155"/>
+                <w:sz w:val="19"/>
+                <w:szCs w:val="19"/>
+              </w:rPr>
+              <w:t xml:space="preserve">Chưa điểm danh, chưa tới giờ chốt</w:t>
+            </w:r>
+          </w:p>
+        </w:tc>
+        <w:tc>
+          <w:tcPr>
+            <w:tcW w:w="1800" w:type="dxa"/>
+            <w:noWrap/>
+          </w:tcPr>
+          <w:p>
+            <w:pPr/>
+            <w:r>
+              <w:rPr>
+                <w:rFonts w:ascii="Arial" w:hAnsi="Arial" w:eastAsia="Arial" w:cs="Arial"/>
+                <w:color w:val="334155"/>
+                <w:sz w:val="19"/>
+                <w:szCs w:val="19"/>
+              </w:rPr>
+              <w:t xml:space="preserve">Không</w:t>
+            </w:r>
+          </w:p>
+        </w:tc>
+        <w:tc>
+          <w:tcPr>
+            <w:tcW w:w="3800" w:type="dxa"/>
+            <w:noWrap/>
+          </w:tcPr>
+          <w:p>
+            <w:pPr/>
+            <w:r>
+              <w:rPr>
+                <w:rFonts w:ascii="Arial" w:hAnsi="Arial" w:eastAsia="Arial" w:cs="Arial"/>
+                <w:color w:val="334155"/>
+                <w:sz w:val="19"/>
+                <w:szCs w:val="19"/>
+              </w:rPr>
+              <w:t xml:space="preserve">—</w:t>
+            </w:r>
+          </w:p>
+        </w:tc>
+      </w:tr>
+      <w:tr>
+        <w:trPr/>
+        <w:tc>
+          <w:tcPr>
+            <w:tcW w:w="3300" w:type="dxa"/>
+            <w:noWrap/>
+          </w:tcPr>
+          <w:p>
+            <w:pPr/>
+            <w:r>
+              <w:rPr>
+                <w:rFonts w:ascii="Arial" w:hAnsi="Arial" w:eastAsia="Arial" w:cs="Arial"/>
+                <w:color w:val="334155"/>
+                <w:sz w:val="19"/>
+                <w:szCs w:val="19"/>
+              </w:rPr>
+              <w:t xml:space="preserve">Buổi hủy / cả lớp chưa ai điểm danh</w:t>
+            </w:r>
+          </w:p>
+        </w:tc>
+        <w:tc>
+          <w:tcPr>
+            <w:tcW w:w="1800" w:type="dxa"/>
+            <w:noWrap/>
+          </w:tcPr>
+          <w:p>
+            <w:pPr/>
+            <w:r>
+              <w:rPr>
+                <w:rFonts w:ascii="Arial" w:hAnsi="Arial" w:eastAsia="Arial" w:cs="Arial"/>
+                <w:color w:val="334155"/>
+                <w:sz w:val="19"/>
+                <w:szCs w:val="19"/>
+              </w:rPr>
+              <w:t xml:space="preserve">Không</w:t>
+            </w:r>
+          </w:p>
+        </w:tc>
+        <w:tc>
+          <w:tcPr>
+            <w:tcW w:w="3800" w:type="dxa"/>
+            <w:noWrap/>
+          </w:tcPr>
+          <w:p>
+            <w:pPr/>
+            <w:r>
+              <w:rPr>
+                <w:rFonts w:ascii="Arial" w:hAnsi="Arial" w:eastAsia="Arial" w:cs="Arial"/>
+                <w:color w:val="334155"/>
+                <w:sz w:val="19"/>
+                <w:szCs w:val="19"/>
+              </w:rPr>
+              <w:t xml:space="preserve">—</w:t>
+            </w:r>
+          </w:p>
+        </w:tc>
+      </w:tr>
+    </w:tbl>
+    <w:p/>
+    <w:tbl>
+      <w:tblGrid>
+        <w:gridCol/>
+      </w:tblGrid>
+      <w:tblPr>
+        <w:tblW w:w="5000" w:type="pct"/>
+        <w:tblLayout w:type="autofit"/>
+        <w:tblCellMar>
+          <w:top w:w="100" w:type="dxa"/>
+          <w:left w:w="100" w:type="dxa"/>
+          <w:right w:w="100" w:type="dxa"/>
+          <w:bottom w:w="100" w:type="dxa"/>
+        </w:tblCellMar>
+        <w:tblBorders>
+          <w:top w:val="single" w:sz="6" w:color="F59E0B"/>
+          <w:left w:val="single" w:sz="6" w:color="F59E0B"/>
+          <w:right w:val="single" w:sz="6" w:color="F59E0B"/>
+          <w:bottom w:val="single" w:sz="6" w:color="F59E0B"/>
+          <w:insideH w:val="single" w:sz="6" w:color="F59E0B"/>
+          <w:insideV w:val="single" w:sz="6" w:color="F59E0B"/>
+        </w:tblBorders>
+      </w:tblPr>
+      <w:tr>
+        <w:trPr/>
+        <w:tc>
+          <w:tcPr>
+            <w:shd w:val="clear" w:fill="FFF7ED"/>
+            <w:noWrap/>
+          </w:tcPr>
+          <w:p>
+            <w:pPr>
+              <w:spacing w:after="0" w:line="264" w:lineRule="auto"/>
+            </w:pPr>
+            <w:r>
+              <w:rPr>
+                <w:rFonts w:ascii="Arial" w:hAnsi="Arial" w:eastAsia="Arial" w:cs="Arial"/>
+                <w:color w:val="9A3412"/>
+                <w:sz w:val="20"/>
+                <w:szCs w:val="20"/>
+                <w:b w:val="1"/>
+                <w:bCs w:val="1"/>
+              </w:rPr>
+              <w:t xml:space="preserve">Đối chiếu chuyên cần: </w:t>
+            </w:r>
+            <w:r>
+              <w:rPr>
+                <w:rFonts w:ascii="Arial" w:hAnsi="Arial" w:eastAsia="Arial" w:cs="Arial"/>
+                <w:color w:val="7C2D12"/>
+                <w:sz w:val="20"/>
+                <w:szCs w:val="20"/>
+              </w:rPr>
+              <w:t xml:space="preserve">Nếu điểm chuyên cần thấp bất thường, kiểm tra các buổi đã khóa / qua giờ chốt: ô trống được suy luận KP. Nếu buổi chưa ai được điểm thì không trừ; nếu đã điểm một phần và để trống phần còn lại thì các ô trống trở thành KP.</w:t>
+            </w:r>
+          </w:p>
+        </w:tc>
+      </w:tr>
+    </w:tbl>
+    <w:p/>
+    <w:p>
+      <w:pPr>
+        <w:pStyle w:val="Heading2"/>
+      </w:pPr>
+      <w:bookmarkStart w:id="50" w:name="_Toc50"/>
+      <w:r>
+        <w:t>11.5. Xếp loại học lực</w:t>
+      </w:r>
+      <w:bookmarkEnd w:id="50"/>
+    </w:p>
+    <w:tbl>
+      <w:tblGrid>
+        <w:gridCol w:w="3500" w:type="dxa"/>
+        <w:gridCol w:w="5400" w:type="dxa"/>
+      </w:tblGrid>
+      <w:tblPr>
+        <w:tblW w:w="5000" w:type="pct"/>
+        <w:tblLayout w:type="autofit"/>
+        <w:tblCellMar>
+          <w:top w:w="80" w:type="dxa"/>
+          <w:left w:w="80" w:type="dxa"/>
+          <w:right w:w="80" w:type="dxa"/>
+          <w:bottom w:w="80" w:type="dxa"/>
+        </w:tblCellMar>
+        <w:tblBorders>
+          <w:top w:val="single" w:sz="4" w:color="CBD5E1"/>
+          <w:left w:val="single" w:sz="4" w:color="CBD5E1"/>
+          <w:right w:val="single" w:sz="4" w:color="CBD5E1"/>
+          <w:bottom w:val="single" w:sz="4" w:color="CBD5E1"/>
+          <w:insideH w:val="single" w:sz="4" w:color="CBD5E1"/>
+          <w:insideV w:val="single" w:sz="4" w:color="CBD5E1"/>
+        </w:tblBorders>
+      </w:tblPr>
+      <w:tr>
+        <w:trPr/>
+        <w:tc>
+          <w:tcPr>
+            <w:tcW w:w="3500" w:type="dxa"/>
+            <w:shd w:val="clear" w:fill="E2E8F0"/>
+            <w:noWrap/>
+          </w:tcPr>
+          <w:p>
+            <w:pPr/>
+            <w:r>
+              <w:rPr>
+                <w:rFonts w:ascii="Arial" w:hAnsi="Arial" w:eastAsia="Arial" w:cs="Arial"/>
+                <w:color w:val="334155"/>
+                <w:sz w:val="19"/>
+                <w:szCs w:val="19"/>
+                <w:b w:val="1"/>
+                <w:bCs w:val="1"/>
+              </w:rPr>
+              <w:t xml:space="preserve">Xếp loại</w:t>
+            </w:r>
+          </w:p>
+        </w:tc>
+        <w:tc>
+          <w:tcPr>
+            <w:tcW w:w="5400" w:type="dxa"/>
+            <w:shd w:val="clear" w:fill="E2E8F0"/>
+            <w:noWrap/>
+          </w:tcPr>
+          <w:p>
+            <w:pPr/>
+            <w:r>
+              <w:rPr>
+                <w:rFonts w:ascii="Arial" w:hAnsi="Arial" w:eastAsia="Arial" w:cs="Arial"/>
+                <w:color w:val="334155"/>
+                <w:sz w:val="19"/>
+                <w:szCs w:val="19"/>
+                <w:b w:val="1"/>
+                <w:bCs w:val="1"/>
+              </w:rPr>
+              <w:t xml:space="preserve">Khoảng điểm</w:t>
+            </w:r>
+          </w:p>
+        </w:tc>
+      </w:tr>
+      <w:tr>
+        <w:trPr/>
+        <w:tc>
+          <w:tcPr>
+            <w:tcW w:w="3500" w:type="dxa"/>
+            <w:noWrap/>
+          </w:tcPr>
+          <w:p>
+            <w:pPr/>
+            <w:r>
+              <w:rPr>
+                <w:rFonts w:ascii="Arial" w:hAnsi="Arial" w:eastAsia="Arial" w:cs="Arial"/>
+                <w:color w:val="334155"/>
+                <w:sz w:val="19"/>
+                <w:szCs w:val="19"/>
+              </w:rPr>
+              <w:t xml:space="preserve">Xuất sắc</w:t>
+            </w:r>
+          </w:p>
+        </w:tc>
+        <w:tc>
+          <w:tcPr>
+            <w:tcW w:w="5400" w:type="dxa"/>
+            <w:noWrap/>
+          </w:tcPr>
+          <w:p>
+            <w:pPr/>
+            <w:r>
+              <w:rPr>
+                <w:rFonts w:ascii="Arial" w:hAnsi="Arial" w:eastAsia="Arial" w:cs="Arial"/>
+                <w:color w:val="334155"/>
+                <w:sz w:val="19"/>
+                <w:szCs w:val="19"/>
+              </w:rPr>
+              <w:t xml:space="preserve">Từ 9,5 đến 10</w:t>
+            </w:r>
+          </w:p>
+        </w:tc>
+      </w:tr>
+      <w:tr>
+        <w:trPr/>
+        <w:tc>
+          <w:tcPr>
+            <w:tcW w:w="3500" w:type="dxa"/>
+            <w:noWrap/>
+          </w:tcPr>
+          <w:p>
+            <w:pPr/>
+            <w:r>
+              <w:rPr>
+                <w:rFonts w:ascii="Arial" w:hAnsi="Arial" w:eastAsia="Arial" w:cs="Arial"/>
+                <w:color w:val="334155"/>
+                <w:sz w:val="19"/>
+                <w:szCs w:val="19"/>
+              </w:rPr>
+              <w:t xml:space="preserve">Giỏi</w:t>
+            </w:r>
+          </w:p>
+        </w:tc>
+        <w:tc>
+          <w:tcPr>
+            <w:tcW w:w="5400" w:type="dxa"/>
+            <w:noWrap/>
+          </w:tcPr>
+          <w:p>
+            <w:pPr/>
+            <w:r>
+              <w:rPr>
+                <w:rFonts w:ascii="Arial" w:hAnsi="Arial" w:eastAsia="Arial" w:cs="Arial"/>
+                <w:color w:val="334155"/>
+                <w:sz w:val="19"/>
+                <w:szCs w:val="19"/>
+              </w:rPr>
+              <w:t xml:space="preserve">Từ 8,0 đến dưới 9,5</w:t>
+            </w:r>
+          </w:p>
+        </w:tc>
+      </w:tr>
+      <w:tr>
+        <w:trPr/>
+        <w:tc>
+          <w:tcPr>
+            <w:tcW w:w="3500" w:type="dxa"/>
+            <w:noWrap/>
+          </w:tcPr>
+          <w:p>
+            <w:pPr/>
+            <w:r>
+              <w:rPr>
+                <w:rFonts w:ascii="Arial" w:hAnsi="Arial" w:eastAsia="Arial" w:cs="Arial"/>
+                <w:color w:val="334155"/>
+                <w:sz w:val="19"/>
+                <w:szCs w:val="19"/>
+              </w:rPr>
+              <w:t xml:space="preserve">Khá</w:t>
+            </w:r>
+          </w:p>
+        </w:tc>
+        <w:tc>
+          <w:tcPr>
+            <w:tcW w:w="5400" w:type="dxa"/>
+            <w:noWrap/>
+          </w:tcPr>
+          <w:p>
+            <w:pPr/>
+            <w:r>
+              <w:rPr>
+                <w:rFonts w:ascii="Arial" w:hAnsi="Arial" w:eastAsia="Arial" w:cs="Arial"/>
+                <w:color w:val="334155"/>
+                <w:sz w:val="19"/>
+                <w:szCs w:val="19"/>
+              </w:rPr>
+              <w:t xml:space="preserve">Từ 6,5 đến dưới 8,0</w:t>
+            </w:r>
+          </w:p>
+        </w:tc>
+      </w:tr>
+      <w:tr>
+        <w:trPr/>
+        <w:tc>
+          <w:tcPr>
+            <w:tcW w:w="3500" w:type="dxa"/>
+            <w:noWrap/>
+          </w:tcPr>
+          <w:p>
+            <w:pPr/>
+            <w:r>
+              <w:rPr>
+                <w:rFonts w:ascii="Arial" w:hAnsi="Arial" w:eastAsia="Arial" w:cs="Arial"/>
+                <w:color w:val="334155"/>
+                <w:sz w:val="19"/>
+                <w:szCs w:val="19"/>
+              </w:rPr>
+              <w:t xml:space="preserve">Trung bình</w:t>
+            </w:r>
+          </w:p>
+        </w:tc>
+        <w:tc>
+          <w:tcPr>
+            <w:tcW w:w="5400" w:type="dxa"/>
+            <w:noWrap/>
+          </w:tcPr>
+          <w:p>
+            <w:pPr/>
+            <w:r>
+              <w:rPr>
+                <w:rFonts w:ascii="Arial" w:hAnsi="Arial" w:eastAsia="Arial" w:cs="Arial"/>
+                <w:color w:val="334155"/>
+                <w:sz w:val="19"/>
+                <w:szCs w:val="19"/>
+              </w:rPr>
+              <w:t xml:space="preserve">Từ 5,0 đến dưới 6,5</w:t>
+            </w:r>
+          </w:p>
+        </w:tc>
+      </w:tr>
+      <w:tr>
+        <w:trPr/>
+        <w:tc>
+          <w:tcPr>
+            <w:tcW w:w="3500" w:type="dxa"/>
+            <w:noWrap/>
+          </w:tcPr>
+          <w:p>
+            <w:pPr/>
+            <w:r>
+              <w:rPr>
+                <w:rFonts w:ascii="Arial" w:hAnsi="Arial" w:eastAsia="Arial" w:cs="Arial"/>
+                <w:color w:val="334155"/>
+                <w:sz w:val="19"/>
+                <w:szCs w:val="19"/>
+              </w:rPr>
+              <w:t xml:space="preserve">Yếu</w:t>
+            </w:r>
+          </w:p>
+        </w:tc>
+        <w:tc>
+          <w:tcPr>
+            <w:tcW w:w="5400" w:type="dxa"/>
+            <w:noWrap/>
+          </w:tcPr>
+          <w:p>
+            <w:pPr/>
+            <w:r>
+              <w:rPr>
+                <w:rFonts w:ascii="Arial" w:hAnsi="Arial" w:eastAsia="Arial" w:cs="Arial"/>
+                <w:color w:val="334155"/>
+                <w:sz w:val="19"/>
+                <w:szCs w:val="19"/>
+              </w:rPr>
+              <w:t xml:space="preserve">Từ 3,5 đến dưới 5,0</w:t>
+            </w:r>
+          </w:p>
+        </w:tc>
+      </w:tr>
+      <w:tr>
+        <w:trPr/>
+        <w:tc>
+          <w:tcPr>
+            <w:tcW w:w="3500" w:type="dxa"/>
+            <w:noWrap/>
+          </w:tcPr>
+          <w:p>
+            <w:pPr/>
+            <w:r>
+              <w:rPr>
+                <w:rFonts w:ascii="Arial" w:hAnsi="Arial" w:eastAsia="Arial" w:cs="Arial"/>
+                <w:color w:val="334155"/>
+                <w:sz w:val="19"/>
+                <w:szCs w:val="19"/>
+              </w:rPr>
+              <w:t xml:space="preserve">Kém</w:t>
+            </w:r>
+          </w:p>
+        </w:tc>
+        <w:tc>
+          <w:tcPr>
+            <w:tcW w:w="5400" w:type="dxa"/>
+            <w:noWrap/>
+          </w:tcPr>
+          <w:p>
+            <w:pPr/>
+            <w:r>
+              <w:rPr>
+                <w:rFonts w:ascii="Arial" w:hAnsi="Arial" w:eastAsia="Arial" w:cs="Arial"/>
+                <w:color w:val="334155"/>
+                <w:sz w:val="19"/>
+                <w:szCs w:val="19"/>
+              </w:rPr>
+              <w:t xml:space="preserve">Dưới 3,5</w:t>
+            </w:r>
+          </w:p>
+        </w:tc>
+      </w:tr>
+    </w:tbl>
+    <w:p/>
+    <w:p>
+      <w:pPr>
+        <w:spacing w:after="120" w:line="276" w:lineRule="auto"/>
+      </w:pPr>
+      <w:r>
+        <w:rPr>
+          <w:rFonts w:ascii="Arial" w:hAnsi="Arial" w:eastAsia="Arial" w:cs="Arial"/>
+          <w:sz w:val="21"/>
+          <w:szCs w:val="21"/>
+        </w:rPr>
+        <w:t xml:space="preserve">Thang xếp loại cố định toàn hệ thống. Học sinh chưa đủ dữ liệu để tính TB thì chưa được xếp loại.</w:t>
+      </w:r>
+    </w:p>
+    <w:p>
+      <w:pPr>
+        <w:pStyle w:val="Heading2"/>
+      </w:pPr>
+      <w:bookmarkStart w:id="51" w:name="_Toc51"/>
+      <w:r>
+        <w:t>11.6. Xuất Excel và thống kê</w:t>
+      </w:r>
+      <w:bookmarkEnd w:id="51"/>
+    </w:p>
+    <w:p>
+      <w:pPr>
+        <w:spacing w:after="60" w:line="264" w:lineRule="auto"/>
+        <w:numPr>
+          <w:ilvl w:val="0"/>
+          <w:numId w:val="6"/>
+        </w:numPr>
+      </w:pPr>
+      <w:r>
+        <w:rPr>
+          <w:rFonts w:ascii="Arial" w:hAnsi="Arial" w:eastAsia="Arial" w:cs="Arial"/>
+          <w:sz w:val="21"/>
+          <w:szCs w:val="21"/>
+        </w:rPr>
+        <w:t xml:space="preserve">Xuất bảng điểm: một workbook toàn giáo xứ, mỗi lớp một sheet; có loại điểm, TB học tập, chuyên cần học/lễ, TB học kỳ, TB cả năm và xếp loại.</w:t>
+      </w:r>
+    </w:p>
+    <w:p>
+      <w:pPr>
+        <w:spacing w:after="60" w:line="264" w:lineRule="auto"/>
+        <w:numPr>
+          <w:ilvl w:val="0"/>
+          <w:numId w:val="6"/>
+        </w:numPr>
+      </w:pPr>
+      <w:r>
+        <w:rPr>
+          <w:rFonts w:ascii="Arial" w:hAnsi="Arial" w:eastAsia="Arial" w:cs="Arial"/>
+          <w:sz w:val="21"/>
+          <w:szCs w:val="21"/>
+        </w:rPr>
+        <w:t xml:space="preserve">Tỉ lệ đang áp dụng được ghi trên tiêu đề và dòng đầu của sheet.</w:t>
+      </w:r>
+    </w:p>
+    <w:p>
+      <w:pPr>
+        <w:spacing w:after="60" w:line="264" w:lineRule="auto"/>
+        <w:numPr>
+          <w:ilvl w:val="0"/>
+          <w:numId w:val="6"/>
+        </w:numPr>
+      </w:pPr>
+      <w:r>
+        <w:rPr>
+          <w:rFonts w:ascii="Arial" w:hAnsi="Arial" w:eastAsia="Arial" w:cs="Arial"/>
+          <w:sz w:val="21"/>
+          <w:szCs w:val="21"/>
+        </w:rPr>
+        <w:t xml:space="preserve">Xuất thống kê điểm: 3 sheet Tổng quan, Phân phối, Chi tiết; gồm HK1, HK2 và cả năm; lấy toàn giáo xứ theo năm học đang chọn.</w:t>
+      </w:r>
+    </w:p>
+    <w:p>
+      <w:pPr>
+        <w:spacing w:after="60" w:line="264" w:lineRule="auto"/>
+        <w:numPr>
+          <w:ilvl w:val="0"/>
+          <w:numId w:val="6"/>
+        </w:numPr>
+      </w:pPr>
+      <w:r>
+        <w:rPr>
+          <w:rFonts w:ascii="Arial" w:hAnsi="Arial" w:eastAsia="Arial" w:cs="Arial"/>
+          <w:sz w:val="21"/>
+          <w:szCs w:val="21"/>
+        </w:rPr>
+        <w:t xml:space="preserve">Nhật ký sửa điểm ghi nhận người sửa, thời gian và dữ liệu thay đổi để đối chiếu.</w:t>
+      </w:r>
+    </w:p>
+    <w:p>
+      <w:pPr>
+        <w:pStyle w:val="Heading1"/>
+      </w:pPr>
+      <w:bookmarkStart w:id="52" w:name="_Toc52"/>
+      <w:r>
+        <w:t>12. Checklist vận hành dành cho Quản trị xứ</w:t>
+      </w:r>
+      <w:bookmarkEnd w:id="52"/>
+    </w:p>
+    <w:p>
+      <w:pPr>
+        <w:pStyle w:val="Heading2"/>
+      </w:pPr>
+      <w:bookmarkStart w:id="53" w:name="_Toc53"/>
+      <w:r>
+        <w:t>12.1. Đầu năm học</w:t>
+      </w:r>
+      <w:bookmarkEnd w:id="53"/>
+    </w:p>
+    <w:p>
+      <w:pPr>
+        <w:spacing w:after="60" w:line="264" w:lineRule="auto"/>
+        <w:numPr>
+          <w:ilvl w:val="0"/>
+          <w:numId w:val="6"/>
+        </w:numPr>
+      </w:pPr>
+      <w:r>
+        <w:rPr>
+          <w:rFonts w:ascii="Arial" w:hAnsi="Arial" w:eastAsia="Arial" w:cs="Arial"/>
+          <w:sz w:val="21"/>
+          <w:szCs w:val="21"/>
+        </w:rPr>
+        <w:t xml:space="preserve">Kích hoạt đúng năm học; tạo/copy lớp; xếp học sinh; phân công GLV.</w:t>
+      </w:r>
+    </w:p>
+    <w:p>
+      <w:pPr>
+        <w:spacing w:after="60" w:line="264" w:lineRule="auto"/>
+        <w:numPr>
+          <w:ilvl w:val="0"/>
+          <w:numId w:val="6"/>
+        </w:numPr>
+      </w:pPr>
+      <w:r>
+        <w:rPr>
+          <w:rFonts w:ascii="Arial" w:hAnsi="Arial" w:eastAsia="Arial" w:cs="Arial"/>
+          <w:sz w:val="21"/>
+          <w:szCs w:val="21"/>
+        </w:rPr>
+        <w:t xml:space="preserve">Cấu hình loại điểm cho từng học kỳ và kiểm tra hệ số / điểm tối đa.</w:t>
+      </w:r>
+    </w:p>
+    <w:p>
+      <w:pPr>
+        <w:spacing w:after="60" w:line="264" w:lineRule="auto"/>
+        <w:numPr>
+          <w:ilvl w:val="0"/>
+          <w:numId w:val="6"/>
+        </w:numPr>
+      </w:pPr>
+      <w:r>
+        <w:rPr>
+          <w:rFonts w:ascii="Arial" w:hAnsi="Arial" w:eastAsia="Arial" w:cs="Arial"/>
+          <w:sz w:val="21"/>
+          <w:szCs w:val="21"/>
+        </w:rPr>
+        <w:t xml:space="preserve">Cấu hình tỉ lệ TB học kỳ, TB cả năm và quy đổi vắng có phép.</w:t>
+      </w:r>
+    </w:p>
+    <w:p>
+      <w:pPr>
+        <w:spacing w:after="60" w:line="264" w:lineRule="auto"/>
+        <w:numPr>
+          <w:ilvl w:val="0"/>
+          <w:numId w:val="6"/>
+        </w:numPr>
+      </w:pPr>
+      <w:r>
+        <w:rPr>
+          <w:rFonts w:ascii="Arial" w:hAnsi="Arial" w:eastAsia="Arial" w:cs="Arial"/>
+          <w:sz w:val="21"/>
+          <w:szCs w:val="21"/>
+        </w:rPr>
+        <w:t xml:space="preserve">Cài giờ chốt điểm danh muộn hơn buổi cuối trong ngày.</w:t>
+      </w:r>
+    </w:p>
+    <w:p>
+      <w:pPr>
+        <w:pStyle w:val="Heading2"/>
+      </w:pPr>
+      <w:bookmarkStart w:id="54" w:name="_Toc54"/>
+      <w:r>
+        <w:t>12.2. Hàng tuần / cuối kỳ</w:t>
+      </w:r>
+      <w:bookmarkEnd w:id="54"/>
+    </w:p>
+    <w:p>
+      <w:pPr>
+        <w:spacing w:after="60" w:line="264" w:lineRule="auto"/>
+        <w:numPr>
+          <w:ilvl w:val="0"/>
+          <w:numId w:val="6"/>
+        </w:numPr>
+      </w:pPr>
+      <w:r>
+        <w:rPr>
+          <w:rFonts w:ascii="Arial" w:hAnsi="Arial" w:eastAsia="Arial" w:cs="Arial"/>
+          <w:sz w:val="21"/>
+          <w:szCs w:val="21"/>
+        </w:rPr>
+        <w:t xml:space="preserve">Kiểm tra cảnh báo buổi đã qua giờ chốt nhưng chưa ai điểm danh.</w:t>
+      </w:r>
+    </w:p>
+    <w:p>
+      <w:pPr>
+        <w:spacing w:after="60" w:line="264" w:lineRule="auto"/>
+        <w:numPr>
+          <w:ilvl w:val="0"/>
+          <w:numId w:val="6"/>
+        </w:numPr>
+      </w:pPr>
+      <w:r>
+        <w:rPr>
+          <w:rFonts w:ascii="Arial" w:hAnsi="Arial" w:eastAsia="Arial" w:cs="Arial"/>
+          <w:sz w:val="21"/>
+          <w:szCs w:val="21"/>
+        </w:rPr>
+        <w:t xml:space="preserve">Hủy các buổi lớp nghỉ; khóa buổi đã hoàn tất nếu cần chốt sớm.</w:t>
+      </w:r>
+    </w:p>
+    <w:p>
+      <w:pPr>
+        <w:spacing w:after="60" w:line="264" w:lineRule="auto"/>
+        <w:numPr>
+          <w:ilvl w:val="0"/>
+          <w:numId w:val="6"/>
+        </w:numPr>
+      </w:pPr>
+      <w:r>
+        <w:rPr>
+          <w:rFonts w:ascii="Arial" w:hAnsi="Arial" w:eastAsia="Arial" w:cs="Arial"/>
+          <w:sz w:val="21"/>
+          <w:szCs w:val="21"/>
+        </w:rPr>
+        <w:t xml:space="preserve">Đối chiếu Excel điểm danh trước khi chốt điểm chuyên cần.</w:t>
+      </w:r>
+    </w:p>
+    <w:p>
+      <w:pPr>
+        <w:spacing w:after="60" w:line="264" w:lineRule="auto"/>
+        <w:numPr>
+          <w:ilvl w:val="0"/>
+          <w:numId w:val="6"/>
+        </w:numPr>
+      </w:pPr>
+      <w:r>
+        <w:rPr>
+          <w:rFonts w:ascii="Arial" w:hAnsi="Arial" w:eastAsia="Arial" w:cs="Arial"/>
+          <w:sz w:val="21"/>
+          <w:szCs w:val="21"/>
+        </w:rPr>
+        <w:t xml:space="preserve">Kiểm tra các ô TB “—” và tooltip lý do; bổ sung giữa kỳ / cuối kỳ hoặc dữ liệu chuyên cần còn thiếu.</w:t>
+      </w:r>
+    </w:p>
+    <w:p>
+      <w:pPr>
+        <w:spacing w:after="60" w:line="264" w:lineRule="auto"/>
+        <w:numPr>
+          <w:ilvl w:val="0"/>
+          <w:numId w:val="6"/>
+        </w:numPr>
+      </w:pPr>
+      <w:r>
+        <w:rPr>
+          <w:rFonts w:ascii="Arial" w:hAnsi="Arial" w:eastAsia="Arial" w:cs="Arial"/>
+          <w:sz w:val="21"/>
+          <w:szCs w:val="21"/>
+        </w:rPr>
+        <w:t xml:space="preserve">Xuất bảng điểm và thống kê toàn giáo xứ để lưu trữ / báo cáo.</w:t>
+      </w:r>
+    </w:p>
     <w:sectPr>
-      <w:footerReference w:type="default" r:id="rId7"/>
       <w:pgSz w:orient="portrait" w:w="11905.511811023622" w:h="16837.79527559055"/>
-      <w:pgMar w:top="1134" w:right="1134" w:bottom="1134" w:left="1418" w:header="720" w:footer="720" w:gutter="0"/>
+      <w:pgMar w:top="900" w:right="1000" w:bottom="900" w:left="1000" w:header="720" w:footer="720" w:gutter="0"/>
       <w:cols w:num="1" w:space="720"/>
     </w:sectPr>
   </w:body>
@@ -2241,26 +4821,12 @@
       <w:jc w:val="center"/>
     </w:pPr>
     <w:r>
-      <w:rPr>
-        <w:color w:val="666666"/>
-        <w:sz w:val="18"/>
-        <w:szCs w:val="18"/>
-        <w:i w:val="1"/>
-        <w:iCs w:val="1"/>
-      </w:rPr>
       <w:t xml:space="preserve">QLGX — Hướng dẫn Quản trị xứ | Trang </w:t>
     </w:r>
     <w:r>
       <w:fldChar w:fldCharType="begin"/>
     </w:r>
     <w:r>
-      <w:rPr>
-        <w:color w:val="666666"/>
-        <w:sz w:val="18"/>
-        <w:szCs w:val="18"/>
-        <w:i w:val="1"/>
-        <w:iCs w:val="1"/>
-      </w:rPr>
       <w:instrText xml:space="preserve">PAGE</w:instrText>
     </w:r>
     <w:r>
@@ -2270,26 +4836,12 @@
       <w:fldChar w:fldCharType="end"/>
     </w:r>
     <w:r>
-      <w:rPr>
-        <w:color w:val="666666"/>
-        <w:sz w:val="18"/>
-        <w:szCs w:val="18"/>
-        <w:i w:val="1"/>
-        <w:iCs w:val="1"/>
-      </w:rPr>
       <w:t xml:space="preserve"> / </w:t>
     </w:r>
     <w:r>
       <w:fldChar w:fldCharType="begin"/>
     </w:r>
     <w:r>
-      <w:rPr>
-        <w:color w:val="666666"/>
-        <w:sz w:val="18"/>
-        <w:szCs w:val="18"/>
-        <w:i w:val="1"/>
-        <w:iCs w:val="1"/>
-      </w:rPr>
       <w:instrText xml:space="preserve">NUMPAGES</w:instrText>
     </w:r>
     <w:r>
@@ -2304,8 +4856,8 @@
 
 <file path=word/numbering.xml><?xml version="1.0" encoding="utf-8"?>
 <w:numbering xmlns:ve="http://schemas.openxmlformats.org/markup-compatibility/2006" xmlns:o="urn:schemas-microsoft-com:office:office" xmlns:r="http://schemas.openxmlformats.org/officeDocument/2006/relationships" xmlns:m="http://schemas.openxmlformats.org/officeDocument/2006/math" xmlns:v="urn:schemas-microsoft-com:vml" xmlns:wp="http://schemas.openxmlformats.org/drawingml/2006/wordprocessingDrawing" xmlns:w10="urn:schemas-microsoft-com:office:word" xmlns:w="http://schemas.openxmlformats.org/wordprocessingml/2006/main" xmlns:wne="http://schemas.microsoft.com/office/word/2006/wordml">
-  <w:abstractNum w:abstractNumId="4">
-    <w:nsid w:val="7894CFA1"/>
+  <w:abstractNum w:abstractNumId="5">
+    <w:nsid w:val="C7147819"/>
     <w:multiLevelType w:val="hybridMultilevel"/>
     <w:lvl w:ilvl="0">
       <w:start w:val="1"/>
@@ -2315,7 +4867,7 @@
       <w:lvlJc w:val="left"/>
       <w:pPr>
         <w:tabs>
-          <w:tab w:val="num" w:pos="720"/>
+          <w:tab w:val="num"/>
         </w:tabs>
         <w:ind w:left="720" w:hanging="360"/>
       </w:pPr>
@@ -2331,7 +4883,7 @@
       <w:lvlJc w:val="left"/>
       <w:pPr>
         <w:tabs>
-          <w:tab w:val="num" w:pos="1440"/>
+          <w:tab w:val="num"/>
         </w:tabs>
         <w:ind w:left="1440" w:hanging="360"/>
       </w:pPr>
@@ -2347,7 +4899,7 @@
       <w:lvlJc w:val="left"/>
       <w:pPr>
         <w:tabs>
-          <w:tab w:val="num" w:pos="2160"/>
+          <w:tab w:val="num"/>
         </w:tabs>
         <w:ind w:left="2160" w:hanging="360"/>
       </w:pPr>
@@ -2363,7 +4915,7 @@
       <w:lvlJc w:val="left"/>
       <w:pPr>
         <w:tabs>
-          <w:tab w:val="num" w:pos="2880"/>
+          <w:tab w:val="num"/>
         </w:tabs>
         <w:ind w:left="2880" w:hanging="360"/>
       </w:pPr>
@@ -2379,7 +4931,7 @@
       <w:lvlJc w:val="left"/>
       <w:pPr>
         <w:tabs>
-          <w:tab w:val="num" w:pos="3600"/>
+          <w:tab w:val="num"/>
         </w:tabs>
         <w:ind w:left="3600" w:hanging="360"/>
       </w:pPr>
@@ -2395,7 +4947,7 @@
       <w:lvlJc w:val="left"/>
       <w:pPr>
         <w:tabs>
-          <w:tab w:val="num" w:pos="4320"/>
+          <w:tab w:val="num"/>
         </w:tabs>
         <w:ind w:left="4320" w:hanging="360"/>
       </w:pPr>
@@ -2411,7 +4963,7 @@
       <w:lvlJc w:val="left"/>
       <w:pPr>
         <w:tabs>
-          <w:tab w:val="num" w:pos="5040"/>
+          <w:tab w:val="num"/>
         </w:tabs>
         <w:ind w:left="5040" w:hanging="360"/>
       </w:pPr>
@@ -2427,7 +4979,7 @@
       <w:lvlJc w:val="left"/>
       <w:pPr>
         <w:tabs>
-          <w:tab w:val="num" w:pos="5760"/>
+          <w:tab w:val="num"/>
         </w:tabs>
         <w:ind w:left="5760" w:hanging="360"/>
       </w:pPr>
@@ -2443,7 +4995,7 @@
       <w:lvlJc w:val="left"/>
       <w:pPr>
         <w:tabs>
-          <w:tab w:val="num" w:pos="6480"/>
+          <w:tab w:val="num"/>
         </w:tabs>
         <w:ind w:left="6480" w:hanging="360"/>
       </w:pPr>
@@ -2452,8 +5004,82 @@
       </w:rPr>
     </w:lvl>
   </w:abstractNum>
-  <w:num w:numId="4">
-    <w:abstractNumId w:val="4"/>
+  <w:abstractNum w:abstractNumId="6">
+    <w:nsid w:val="A00C4CAC"/>
+    <w:multiLevelType w:val="multilevel"/>
+    <w:lvl w:ilvl="0">
+      <w:start w:val="1"/>
+      <w:numFmt w:val="bullet"/>
+      <w:suff w:val="tab"/>
+      <w:lvlText w:val="•"/>
+      <w:pPr>
+        <w:tabs>
+          <w:tab w:val="num" w:pos="720"/>
+        </w:tabs>
+        <w:ind w:left="720" w:hanging="360"/>
+      </w:pPr>
+      <w:rPr>
+        <w:rFonts/>
+      </w:rPr>
+    </w:lvl>
+    <w:lvl w:ilvl="1">
+      <w:start w:val="1"/>
+      <w:numFmt w:val="bullet"/>
+      <w:suff w:val="tab"/>
+      <w:lvlText w:val="–"/>
+      <w:pPr>
+        <w:tabs>
+          <w:tab w:val="num" w:pos="1080"/>
+        </w:tabs>
+        <w:ind w:left="1080" w:hanging="360"/>
+      </w:pPr>
+      <w:rPr>
+        <w:rFonts/>
+      </w:rPr>
+    </w:lvl>
+  </w:abstractNum>
+  <w:abstractNum w:abstractNumId="7">
+    <w:nsid w:val="776E48EB"/>
+    <w:multiLevelType w:val="multilevel"/>
+    <w:lvl w:ilvl="0">
+      <w:start w:val="1"/>
+      <w:numFmt w:val="decimal"/>
+      <w:suff w:val="tab"/>
+      <w:lvlText w:val="%1."/>
+      <w:pPr>
+        <w:tabs>
+          <w:tab w:val="num" w:pos="720"/>
+        </w:tabs>
+        <w:ind w:left="720" w:hanging="360"/>
+      </w:pPr>
+      <w:rPr>
+        <w:rFonts/>
+      </w:rPr>
+    </w:lvl>
+    <w:lvl w:ilvl="1">
+      <w:start w:val="1"/>
+      <w:numFmt w:val="lowerLetter"/>
+      <w:suff w:val="tab"/>
+      <w:lvlText w:val="%2)"/>
+      <w:pPr>
+        <w:tabs>
+          <w:tab w:val="num" w:pos="1080"/>
+        </w:tabs>
+        <w:ind w:left="1080" w:hanging="360"/>
+      </w:pPr>
+      <w:rPr>
+        <w:rFonts/>
+      </w:rPr>
+    </w:lvl>
+  </w:abstractNum>
+  <w:num w:numId="5">
+    <w:abstractNumId w:val="5"/>
+  </w:num>
+  <w:num w:numId="6">
+    <w:abstractNumId w:val="6"/>
+  </w:num>
+  <w:num w:numId="7">
+    <w:abstractNumId w:val="7"/>
   </w:num>
 </w:numbering>
 </file>
@@ -2478,6 +5104,12 @@
     <w:name w:val="Footnote Reference"/>
     <w:semiHidden/>
     <w:unhideWhenUsed/>
+    <w:rPr>
+      <w:vertAlign w:val="superscript"/>
+    </w:rPr>
+  </w:style>
+  <w:style w:type="character">
+    <w:name w:val="Footnote Reference"/>
     <w:rPr>
       <w:vertAlign w:val="superscript"/>
     </w:rPr>

</xml_diff>